<commit_message>
Add terminology chapter, audiovisual translation part and Guild style
- Chapter 21 rewritten from the team's terminology chapter: history and
  schools, terminologists, types of terms, rules for good terms, the Arabic
  academies, termbases, terminology guides and standardisation bodies
- New Part 9 from the AVT course notes: Chapter 26 (types, theories,
  challenges, AVT in the Arab world, dubbing) and Chapter 27 (subtitling,
  classifications, semiotics, strategies, taboo language, censorship)
- Guild style: serif purple headings, one lavender box style for key terms
  and summaries, text wordmark on cover and new back cover
- 11 new references checked online; subtitle line length and Wüster
  details corrected; references now sorted automatically
- Feedback report updated with the second batch of materials

Co-Authored-By: Claude Opus 5.5 <noreply@anthropic.com>
Claude-Session: https://claude.ai/code/session_01VkNWz9zCVkDAANuF8jpQYy
</commit_message>
<xml_diff>
--- a/Handbook-Feedback-Report.docx
+++ b/Handbook-Feedback-Report.docx
@@ -133,13 +133,13 @@
           <w:b/>
           <w:bCs/>
         </w:rPr>
-        <w:t xml:space="preserve">second Word version</w:t>
+        <w:t xml:space="preserve">third Word version</w:t>
       </w:r>
       <w:r>
         <w:rPr>
           <w:rFonts w:ascii="Calibri" w:cs="Calibri" w:eastAsia="Calibri" w:hAnsi="Calibri"/>
         </w:rPr>
-        <w:t xml:space="preserve"> of the handbook.</w:t>
+        <w:t xml:space="preserve"> of the handbook, which adds the second batch of materials (the terminology chapter and the audiovisual translation notes) and the Guild visual style.</w:t>
       </w:r>
     </w:p>
     <w:p>
@@ -163,7 +163,7 @@
         <w:rPr>
           <w:rFonts w:ascii="Calibri" w:cs="Calibri" w:eastAsia="Calibri" w:hAnsi="Calibri"/>
         </w:rPr>
-        <w:t xml:space="preserve">An editable Word document (Translation-Handbook.docx), B5 size, about 87 pages, in a plain layout.</w:t>
+        <w:t xml:space="preserve">An editable Word document (Translation-Handbook.docx), B5 size, about 100 pages, in a simple layout based on the style of Guild’s posts.</w:t>
       </w:r>
     </w:p>
     <w:p>
@@ -187,13 +187,13 @@
           <w:b/>
           <w:bCs/>
         </w:rPr>
-        <w:t xml:space="preserve">8 parts and 25 chapters</w:t>
+        <w:t xml:space="preserve">9 parts and 27 chapters</w:t>
       </w:r>
       <w:r>
         <w:rPr>
           <w:rFonts w:ascii="Calibri" w:cs="Calibri" w:eastAsia="Calibri" w:hAnsi="Calibri"/>
         </w:rPr>
-        <w:t xml:space="preserve">, ordered from easy to hard: getting started; meaning; words that go together; methods and techniques; culture and new words; whole texts; tools and resources; checking and explaining.</w:t>
+        <w:t xml:space="preserve">, ordered from easy to hard: getting started; meaning; words that go together; methods and techniques; culture and new words; whole texts; tools and resources; checking and explaining; and, last and most advanced, audiovisual translation.</w:t>
       </w:r>
     </w:p>
     <w:p>
@@ -255,7 +255,7 @@
         <w:rPr>
           <w:rFonts w:ascii="Calibri" w:cs="Calibri" w:eastAsia="Calibri" w:hAnsi="Calibri"/>
         </w:rPr>
-        <w:t xml:space="preserve">Back matter: practice in three levels with an answer key, five checklists (including one based on Fairclough and a placeholder for Dr Abdullah’s framework), future editions, a glossary of 97 terms built from the key terms of every chapter, and the references.</w:t>
+        <w:t xml:space="preserve">Back matter: practice in three levels with an answer key, five checklists (including one based on Fairclough and a placeholder for Dr Abdullah’s framework), future editions, a glossary of 110 terms built from the key terms of every chapter, the references and a back cover.</w:t>
       </w:r>
     </w:p>
     <w:p>
@@ -662,6 +662,494 @@
                 <w:szCs w:val="18"/>
               </w:rPr>
               <w:t xml:space="preserve">Used for colours in the earlier PDF versions. The final Word version uses a plain text title page.</w:t>
+            </w:r>
+          </w:p>
+        </w:tc>
+      </w:tr>
+    </w:tbl>
+    <w:p>
+      <w:pPr>
+        <w:spacing w:after="120"/>
+      </w:pPr>
+    </w:p>
+    <w:p>
+      <w:pPr>
+        <w:pStyle w:val="Heading3"/>
+      </w:pPr>
+      <w:r>
+        <w:t xml:space="preserve">Second batch of materials</w:t>
+      </w:r>
+    </w:p>
+    <w:tbl>
+      <w:tblPr>
+        <w:tblW w:type="dxa" w:w="9638"/>
+        <w:tblBorders>
+          <w:top w:val="single" w:color="CFC9DE" w:sz="4"/>
+          <w:left w:val="single" w:color="CFC9DE" w:sz="4"/>
+          <w:bottom w:val="single" w:color="CFC9DE" w:sz="4"/>
+          <w:right w:val="single" w:color="CFC9DE" w:sz="4"/>
+          <w:insideH w:val="single" w:color="CFC9DE" w:sz="4"/>
+          <w:insideV w:val="single" w:color="CFC9DE" w:sz="4"/>
+        </w:tblBorders>
+      </w:tblPr>
+      <w:tblGrid>
+        <w:gridCol w:w="2506"/>
+        <w:gridCol w:w="4241"/>
+        <w:gridCol w:w="2891"/>
+      </w:tblGrid>
+      <w:tr>
+        <w:trPr>
+          <w:tblHeader/>
+        </w:trPr>
+        <w:tc>
+          <w:tcPr>
+            <w:tcW w:type="dxa" w:w="2506"/>
+            <w:shd w:fill="EFEBF8" w:color="auto" w:val="clear"/>
+            <w:tcMar>
+              <w:top w:type="dxa" w:w="60"/>
+              <w:left w:type="dxa" w:w="90"/>
+              <w:bottom w:type="dxa" w:w="60"/>
+              <w:right w:type="dxa" w:w="90"/>
+            </w:tcMar>
+          </w:tcPr>
+          <w:p>
+            <w:pPr>
+              <w:spacing w:after="0" w:line="264"/>
+            </w:pPr>
+            <w:r>
+              <w:rPr>
+                <w:rFonts w:ascii="Calibri" w:cs="Calibri" w:eastAsia="Calibri" w:hAnsi="Calibri"/>
+                <w:b/>
+                <w:bCs/>
+                <w:color w:val="3D1591"/>
+                <w:sz w:val="18"/>
+                <w:szCs w:val="18"/>
+              </w:rPr>
+              <w:t xml:space="preserve">Material</w:t>
+            </w:r>
+          </w:p>
+        </w:tc>
+        <w:tc>
+          <w:tcPr>
+            <w:tcW w:type="dxa" w:w="4241"/>
+            <w:shd w:fill="EFEBF8" w:color="auto" w:val="clear"/>
+            <w:tcMar>
+              <w:top w:type="dxa" w:w="60"/>
+              <w:left w:type="dxa" w:w="90"/>
+              <w:bottom w:type="dxa" w:w="60"/>
+              <w:right w:type="dxa" w:w="90"/>
+            </w:tcMar>
+          </w:tcPr>
+          <w:p>
+            <w:pPr>
+              <w:spacing w:after="0" w:line="264"/>
+            </w:pPr>
+            <w:r>
+              <w:rPr>
+                <w:rFonts w:ascii="Calibri" w:cs="Calibri" w:eastAsia="Calibri" w:hAnsi="Calibri"/>
+                <w:b/>
+                <w:bCs/>
+                <w:color w:val="3D1591"/>
+                <w:sz w:val="18"/>
+                <w:szCs w:val="18"/>
+              </w:rPr>
+              <w:t xml:space="preserve">What it contained</w:t>
+            </w:r>
+          </w:p>
+        </w:tc>
+        <w:tc>
+          <w:tcPr>
+            <w:tcW w:type="dxa" w:w="2891"/>
+            <w:shd w:fill="EFEBF8" w:color="auto" w:val="clear"/>
+            <w:tcMar>
+              <w:top w:type="dxa" w:w="60"/>
+              <w:left w:type="dxa" w:w="90"/>
+              <w:bottom w:type="dxa" w:w="60"/>
+              <w:right w:type="dxa" w:w="90"/>
+            </w:tcMar>
+          </w:tcPr>
+          <w:p>
+            <w:pPr>
+              <w:spacing w:after="0" w:line="264"/>
+            </w:pPr>
+            <w:r>
+              <w:rPr>
+                <w:rFonts w:ascii="Calibri" w:cs="Calibri" w:eastAsia="Calibri" w:hAnsi="Calibri"/>
+                <w:b/>
+                <w:bCs/>
+                <w:color w:val="3D1591"/>
+                <w:sz w:val="18"/>
+                <w:szCs w:val="18"/>
+              </w:rPr>
+              <w:t xml:space="preserve">How it was used</w:t>
+            </w:r>
+          </w:p>
+        </w:tc>
+      </w:tr>
+      <w:tr>
+        <w:trPr>
+          <w:cantSplit/>
+        </w:trPr>
+        <w:tc>
+          <w:tcPr>
+            <w:tcW w:type="dxa" w:w="2506"/>
+            <w:tcMar>
+              <w:top w:type="dxa" w:w="60"/>
+              <w:left w:type="dxa" w:w="90"/>
+              <w:bottom w:type="dxa" w:w="60"/>
+              <w:right w:type="dxa" w:w="90"/>
+            </w:tcMar>
+          </w:tcPr>
+          <w:p>
+            <w:pPr>
+              <w:spacing w:after="0" w:line="264"/>
+            </w:pPr>
+            <w:r>
+              <w:rPr>
+                <w:rFonts w:ascii="Calibri" w:cs="Calibri" w:eastAsia="Calibri" w:hAnsi="Calibri"/>
+                <w:b/>
+                <w:bCs/>
+                <w:sz w:val="18"/>
+                <w:szCs w:val="18"/>
+              </w:rPr>
+              <w:t xml:space="preserve">Terminology_chapter.docx</w:t>
+            </w:r>
+          </w:p>
+        </w:tc>
+        <w:tc>
+          <w:tcPr>
+            <w:tcW w:type="dxa" w:w="4241"/>
+            <w:tcMar>
+              <w:top w:type="dxa" w:w="60"/>
+              <w:left w:type="dxa" w:w="90"/>
+              <w:bottom w:type="dxa" w:w="60"/>
+              <w:right w:type="dxa" w:w="90"/>
+            </w:tcMar>
+          </w:tcPr>
+          <w:p>
+            <w:pPr>
+              <w:spacing w:after="0" w:line="264"/>
+            </w:pPr>
+            <w:r>
+              <w:rPr>
+                <w:rFonts w:ascii="Calibri" w:cs="Calibri" w:eastAsia="Calibri" w:hAnsi="Calibri"/>
+                <w:sz w:val="18"/>
+                <w:szCs w:val="18"/>
+              </w:rPr>
+              <w:t xml:space="preserve">Definition and history of terminology; how translators benefit; functions; how terminologists work; translator skills; categories of terms; rules for naming terms; the Arabic academies; how to translate a term; technical dictionaries; termbases; standardisation bodies.</w:t>
+            </w:r>
+          </w:p>
+        </w:tc>
+        <w:tc>
+          <w:tcPr>
+            <w:tcW w:type="dxa" w:w="2891"/>
+            <w:tcMar>
+              <w:top w:type="dxa" w:w="60"/>
+              <w:left w:type="dxa" w:w="90"/>
+              <w:bottom w:type="dxa" w:w="60"/>
+              <w:right w:type="dxa" w:w="90"/>
+            </w:tcMar>
+          </w:tcPr>
+          <w:p>
+            <w:pPr>
+              <w:spacing w:after="0" w:line="264"/>
+            </w:pPr>
+            <w:r>
+              <w:rPr>
+                <w:rFonts w:ascii="Calibri" w:cs="Calibri" w:eastAsia="Calibri" w:hAnsi="Calibri"/>
+                <w:sz w:val="18"/>
+                <w:szCs w:val="18"/>
+              </w:rPr>
+              <w:t xml:space="preserve">Rewritten in plain English as Chapter 21, Terminology and terminology management. Nearly all points kept; repeated points merged; facts checked (Section 11).</w:t>
+            </w:r>
+          </w:p>
+        </w:tc>
+      </w:tr>
+      <w:tr>
+        <w:trPr>
+          <w:cantSplit/>
+        </w:trPr>
+        <w:tc>
+          <w:tcPr>
+            <w:tcW w:type="dxa" w:w="2506"/>
+            <w:tcMar>
+              <w:top w:type="dxa" w:w="60"/>
+              <w:left w:type="dxa" w:w="90"/>
+              <w:bottom w:type="dxa" w:w="60"/>
+              <w:right w:type="dxa" w:w="90"/>
+            </w:tcMar>
+          </w:tcPr>
+          <w:p>
+            <w:pPr>
+              <w:spacing w:after="0" w:line="264"/>
+            </w:pPr>
+            <w:r>
+              <w:rPr>
+                <w:rFonts w:ascii="Calibri" w:cs="Calibri" w:eastAsia="Calibri" w:hAnsi="Calibri"/>
+                <w:b/>
+                <w:bCs/>
+                <w:sz w:val="18"/>
+                <w:szCs w:val="18"/>
+              </w:rPr>
+              <w:t xml:space="preserve">Intro_to_AVT.pdf</w:t>
+            </w:r>
+            <w:r>
+              <w:rPr>
+                <w:rFonts w:ascii="Calibri" w:cs="Calibri" w:eastAsia="Calibri" w:hAnsi="Calibri"/>
+                <w:sz w:val="18"/>
+                <w:szCs w:val="18"/>
+              </w:rPr>
+              <w:t xml:space="preserve"> and </w:t>
+            </w:r>
+            <w:r>
+              <w:rPr>
+                <w:rFonts w:ascii="Calibri" w:cs="Calibri" w:eastAsia="Calibri" w:hAnsi="Calibri"/>
+                <w:b/>
+                <w:bCs/>
+                <w:sz w:val="18"/>
+                <w:szCs w:val="18"/>
+              </w:rPr>
+              <w:t xml:space="preserve">AVT_2.pdf</w:t>
+            </w:r>
+            <w:r>
+              <w:rPr>
+                <w:rFonts w:ascii="Calibri" w:cs="Calibri" w:eastAsia="Calibri" w:hAnsi="Calibri"/>
+                <w:sz w:val="18"/>
+                <w:szCs w:val="18"/>
+              </w:rPr>
+              <w:t xml:space="preserve"> (course notes)</w:t>
+            </w:r>
+          </w:p>
+        </w:tc>
+        <w:tc>
+          <w:tcPr>
+            <w:tcW w:type="dxa" w:w="4241"/>
+            <w:tcMar>
+              <w:top w:type="dxa" w:w="60"/>
+              <w:left w:type="dxa" w:w="90"/>
+              <w:bottom w:type="dxa" w:w="60"/>
+              <w:right w:type="dxa" w:w="90"/>
+            </w:tcMar>
+          </w:tcPr>
+          <w:p>
+            <w:pPr>
+              <w:spacing w:after="0" w:line="264"/>
+            </w:pPr>
+            <w:r>
+              <w:rPr>
+                <w:rFonts w:ascii="Calibri" w:cs="Calibri" w:eastAsia="Calibri" w:hAnsi="Calibri"/>
+                <w:sz w:val="18"/>
+                <w:szCs w:val="18"/>
+              </w:rPr>
+              <w:t xml:space="preserve">Why AVT is growing and special; terminological progress; types of AVT; theories (Skopos, DTS, reception studies, polysystem); challenges; AVT in the Arab world; dubbing; subtitling (classifications, semiotics, linguistic variation, strategies of Díaz Cintas and Remael and of Pedersen); taboo language and censorship.</w:t>
+            </w:r>
+          </w:p>
+        </w:tc>
+        <w:tc>
+          <w:tcPr>
+            <w:tcW w:type="dxa" w:w="2891"/>
+            <w:tcMar>
+              <w:top w:type="dxa" w:w="60"/>
+              <w:left w:type="dxa" w:w="90"/>
+              <w:bottom w:type="dxa" w:w="60"/>
+              <w:right w:type="dxa" w:w="90"/>
+            </w:tcMar>
+          </w:tcPr>
+          <w:p>
+            <w:pPr>
+              <w:spacing w:after="0" w:line="264"/>
+            </w:pPr>
+            <w:r>
+              <w:rPr>
+                <w:rFonts w:ascii="Calibri" w:cs="Calibri" w:eastAsia="Calibri" w:hAnsi="Calibri"/>
+                <w:sz w:val="18"/>
+                <w:szCs w:val="18"/>
+              </w:rPr>
+              <w:t xml:space="preserve">Rewritten as a new Part 9, Chapters 26 (Introduction to audiovisual translation) and 27 (Subtitling), placed last because it is the most advanced topic.</w:t>
+            </w:r>
+          </w:p>
+        </w:tc>
+      </w:tr>
+      <w:tr>
+        <w:trPr>
+          <w:cantSplit/>
+        </w:trPr>
+        <w:tc>
+          <w:tcPr>
+            <w:tcW w:type="dxa" w:w="2506"/>
+            <w:tcMar>
+              <w:top w:type="dxa" w:w="60"/>
+              <w:left w:type="dxa" w:w="90"/>
+              <w:bottom w:type="dxa" w:w="60"/>
+              <w:right w:type="dxa" w:w="90"/>
+            </w:tcMar>
+          </w:tcPr>
+          <w:p>
+            <w:pPr>
+              <w:spacing w:after="0" w:line="264"/>
+            </w:pPr>
+            <w:r>
+              <w:rPr>
+                <w:rFonts w:ascii="Calibri" w:cs="Calibri" w:eastAsia="Calibri" w:hAnsi="Calibri"/>
+                <w:b/>
+                <w:bCs/>
+                <w:sz w:val="18"/>
+                <w:szCs w:val="18"/>
+              </w:rPr>
+              <w:t xml:space="preserve">Guild post screenshots</w:t>
+            </w:r>
+          </w:p>
+        </w:tc>
+        <w:tc>
+          <w:tcPr>
+            <w:tcW w:type="dxa" w:w="4241"/>
+            <w:tcMar>
+              <w:top w:type="dxa" w:w="60"/>
+              <w:left w:type="dxa" w:w="90"/>
+              <w:bottom w:type="dxa" w:w="60"/>
+              <w:right w:type="dxa" w:w="90"/>
+            </w:tcMar>
+          </w:tcPr>
+          <w:p>
+            <w:pPr>
+              <w:spacing w:after="0" w:line="264"/>
+            </w:pPr>
+            <w:r>
+              <w:rPr>
+                <w:rFonts w:ascii="Calibri" w:cs="Calibri" w:eastAsia="Calibri" w:hAnsi="Calibri"/>
+                <w:sz w:val="18"/>
+                <w:szCs w:val="18"/>
+              </w:rPr>
+              <w:t xml:space="preserve">The club’s visual style.</w:t>
+            </w:r>
+          </w:p>
+        </w:tc>
+        <w:tc>
+          <w:tcPr>
+            <w:tcW w:type="dxa" w:w="2891"/>
+            <w:tcMar>
+              <w:top w:type="dxa" w:w="60"/>
+              <w:left w:type="dxa" w:w="90"/>
+              <w:bottom w:type="dxa" w:w="60"/>
+              <w:right w:type="dxa" w:w="90"/>
+            </w:tcMar>
+          </w:tcPr>
+          <w:p>
+            <w:pPr>
+              <w:spacing w:after="0" w:line="264"/>
+            </w:pPr>
+            <w:r>
+              <w:rPr>
+                <w:rFonts w:ascii="Calibri" w:cs="Calibri" w:eastAsia="Calibri" w:hAnsi="Calibri"/>
+                <w:sz w:val="18"/>
+                <w:szCs w:val="18"/>
+              </w:rPr>
+              <w:t xml:space="preserve">Used as a reference: white pages, deep purple serif headings, one lavender box style for key terms and summaries, the Guild wordmark on the cover and back cover.</w:t>
+            </w:r>
+          </w:p>
+        </w:tc>
+      </w:tr>
+      <w:tr>
+        <w:trPr>
+          <w:cantSplit/>
+        </w:trPr>
+        <w:tc>
+          <w:tcPr>
+            <w:tcW w:type="dxa" w:w="2506"/>
+            <w:tcMar>
+              <w:top w:type="dxa" w:w="60"/>
+              <w:left w:type="dxa" w:w="90"/>
+              <w:bottom w:type="dxa" w:w="60"/>
+              <w:right w:type="dxa" w:w="90"/>
+            </w:tcMar>
+          </w:tcPr>
+          <w:p>
+            <w:pPr>
+              <w:spacing w:after="0" w:line="264"/>
+            </w:pPr>
+            <w:r>
+              <w:rPr>
+                <w:rFonts w:ascii="Calibri" w:cs="Calibri" w:eastAsia="Calibri" w:hAnsi="Calibri"/>
+                <w:b/>
+                <w:bCs/>
+                <w:sz w:val="18"/>
+                <w:szCs w:val="18"/>
+              </w:rPr>
+              <w:t xml:space="preserve">Draft_one.docx</w:t>
+            </w:r>
+            <w:r>
+              <w:rPr>
+                <w:rFonts w:ascii="Calibri" w:cs="Calibri" w:eastAsia="Calibri" w:hAnsi="Calibri"/>
+                <w:sz w:val="18"/>
+                <w:szCs w:val="18"/>
+              </w:rPr>
+              <w:t xml:space="preserve"> and </w:t>
+            </w:r>
+            <w:r>
+              <w:rPr>
+                <w:rFonts w:ascii="Calibri" w:cs="Calibri" w:eastAsia="Calibri" w:hAnsi="Calibri"/>
+                <w:b/>
+                <w:bCs/>
+                <w:sz w:val="18"/>
+                <w:szCs w:val="18"/>
+              </w:rPr>
+              <w:t xml:space="preserve">the notes</w:t>
+            </w:r>
+            <w:r>
+              <w:rPr>
+                <w:rFonts w:ascii="Calibri" w:cs="Calibri" w:eastAsia="Calibri" w:hAnsi="Calibri"/>
+                <w:sz w:val="18"/>
+                <w:szCs w:val="18"/>
+              </w:rPr>
+              <w:t xml:space="preserve"> (again)</w:t>
+            </w:r>
+          </w:p>
+        </w:tc>
+        <w:tc>
+          <w:tcPr>
+            <w:tcW w:type="dxa" w:w="4241"/>
+            <w:tcMar>
+              <w:top w:type="dxa" w:w="60"/>
+              <w:left w:type="dxa" w:w="90"/>
+              <w:bottom w:type="dxa" w:w="60"/>
+              <w:right w:type="dxa" w:w="90"/>
+            </w:tcMar>
+          </w:tcPr>
+          <w:p>
+            <w:pPr>
+              <w:spacing w:after="0" w:line="264"/>
+            </w:pPr>
+            <w:r>
+              <w:rPr>
+                <w:rFonts w:ascii="Calibri" w:cs="Calibri" w:eastAsia="Calibri" w:hAnsi="Calibri"/>
+                <w:sz w:val="18"/>
+                <w:szCs w:val="18"/>
+              </w:rPr>
+              <w:t xml:space="preserve">The draft is identical to the first copy; the notes differ only in two typing corrections.</w:t>
+            </w:r>
+          </w:p>
+        </w:tc>
+        <w:tc>
+          <w:tcPr>
+            <w:tcW w:type="dxa" w:w="2891"/>
+            <w:tcMar>
+              <w:top w:type="dxa" w:w="60"/>
+              <w:left w:type="dxa" w:w="90"/>
+              <w:bottom w:type="dxa" w:w="60"/>
+              <w:right w:type="dxa" w:w="90"/>
+            </w:tcMar>
+          </w:tcPr>
+          <w:p>
+            <w:pPr>
+              <w:spacing w:after="0" w:line="264"/>
+            </w:pPr>
+            <w:r>
+              <w:rPr>
+                <w:rFonts w:ascii="Calibri" w:cs="Calibri" w:eastAsia="Calibri" w:hAnsi="Calibri"/>
+                <w:sz w:val="18"/>
+                <w:szCs w:val="18"/>
+              </w:rPr>
+              <w:t xml:space="preserve">No change needed.</w:t>
             </w:r>
           </w:p>
         </w:tc>
@@ -900,7 +1388,7 @@
         <w:rPr>
           <w:rFonts w:ascii="Calibri" w:cs="Calibri" w:eastAsia="Calibri" w:hAnsi="Calibri"/>
         </w:rPr>
-        <w:t xml:space="preserve">Contributions assigned to team members: Shaikha (organisation and examples), Masooma (practice texts and the terminology chapter), Loulwah (dictionary examples).</w:t>
+        <w:t xml:space="preserve">Contributions assigned to team members: Shaikha (organisation and examples), Masooma (practice texts; her terminology chapter has now been received and used), Loulwah (dictionary examples and machine translation notes).</w:t>
       </w:r>
     </w:p>
     <w:p>
@@ -1514,7 +2002,7 @@
                 <w:sz w:val="18"/>
                 <w:szCs w:val="18"/>
               </w:rPr>
-              <w:t xml:space="preserve">7. Word document, second version (current)</w:t>
+              <w:t xml:space="preserve">7. Word document, second version</w:t>
             </w:r>
           </w:p>
         </w:tc>
@@ -1563,6 +2051,83 @@
                 <w:szCs w:val="18"/>
               </w:rPr>
               <w:t xml:space="preserve">Instruction: follow the professor’s instructions, table of contents and chapters, in chronological order, step by step, and make it publishable.</w:t>
+            </w:r>
+          </w:p>
+        </w:tc>
+      </w:tr>
+      <w:tr>
+        <w:trPr>
+          <w:cantSplit/>
+        </w:trPr>
+        <w:tc>
+          <w:tcPr>
+            <w:tcW w:type="dxa" w:w="2506"/>
+            <w:tcMar>
+              <w:top w:type="dxa" w:w="60"/>
+              <w:left w:type="dxa" w:w="90"/>
+              <w:bottom w:type="dxa" w:w="60"/>
+              <w:right w:type="dxa" w:w="90"/>
+            </w:tcMar>
+          </w:tcPr>
+          <w:p>
+            <w:pPr>
+              <w:spacing w:after="0" w:line="264"/>
+            </w:pPr>
+            <w:r>
+              <w:rPr>
+                <w:rFonts w:ascii="Calibri" w:cs="Calibri" w:eastAsia="Calibri" w:hAnsi="Calibri"/>
+                <w:sz w:val="18"/>
+                <w:szCs w:val="18"/>
+              </w:rPr>
+              <w:t xml:space="preserve">8. Word document, third version (current)</w:t>
+            </w:r>
+          </w:p>
+        </w:tc>
+        <w:tc>
+          <w:tcPr>
+            <w:tcW w:type="dxa" w:w="3855"/>
+            <w:tcMar>
+              <w:top w:type="dxa" w:w="60"/>
+              <w:left w:type="dxa" w:w="90"/>
+              <w:bottom w:type="dxa" w:w="60"/>
+              <w:right w:type="dxa" w:w="90"/>
+            </w:tcMar>
+          </w:tcPr>
+          <w:p>
+            <w:pPr>
+              <w:spacing w:after="0" w:line="264"/>
+            </w:pPr>
+            <w:r>
+              <w:rPr>
+                <w:rFonts w:ascii="Calibri" w:cs="Calibri" w:eastAsia="Calibri" w:hAnsi="Calibri"/>
+                <w:sz w:val="18"/>
+                <w:szCs w:val="18"/>
+              </w:rPr>
+              <w:t xml:space="preserve">Terminology chapter merged into Chapter 21; new Part 9 on audiovisual translation (Chapters 26 and 27); Guild visual style; back cover; 11 new references checked online.</w:t>
+            </w:r>
+          </w:p>
+        </w:tc>
+        <w:tc>
+          <w:tcPr>
+            <w:tcW w:type="dxa" w:w="3277"/>
+            <w:tcMar>
+              <w:top w:type="dxa" w:w="60"/>
+              <w:left w:type="dxa" w:w="90"/>
+              <w:bottom w:type="dxa" w:w="60"/>
+              <w:right w:type="dxa" w:w="90"/>
+            </w:tcMar>
+          </w:tcPr>
+          <w:p>
+            <w:pPr>
+              <w:spacing w:after="0" w:line="264"/>
+            </w:pPr>
+            <w:r>
+              <w:rPr>
+                <w:rFonts w:ascii="Calibri" w:cs="Calibri" w:eastAsia="Calibri" w:hAnsi="Calibri"/>
+                <w:sz w:val="18"/>
+                <w:szCs w:val="18"/>
+              </w:rPr>
+              <w:t xml:space="preserve">New materials and Guild posts supplied, with full authority to edit, add and remove.</w:t>
             </w:r>
           </w:p>
         </w:tc>
@@ -2060,7 +2625,7 @@
                 <w:sz w:val="18"/>
                 <w:szCs w:val="18"/>
               </w:rPr>
-              <w:t xml:space="preserve">Chapter 1</w:t>
+              <w:t xml:space="preserve">Chapter 1; Part 9</w:t>
             </w:r>
           </w:p>
         </w:tc>
@@ -2084,7 +2649,7 @@
                 <w:sz w:val="18"/>
                 <w:szCs w:val="18"/>
               </w:rPr>
-              <w:t xml:space="preserve">Written translation, interpreting (simultaneous and consecutive), sight translation, subtitling and localisation.</w:t>
+              <w:t xml:space="preserve">Written translation, interpreting, sight translation, audiovisual translation and localisation; Part 9 covers the types of AVT in detail.</w:t>
             </w:r>
           </w:p>
         </w:tc>
@@ -2496,7 +3061,7 @@
                 <w:sz w:val="18"/>
                 <w:szCs w:val="18"/>
               </w:rPr>
-              <w:t xml:space="preserve">Includes the draft’s point that post-editing is the new direction. Loulwah’s notes were not received.</w:t>
+              <w:t xml:space="preserve">Includes the draft’s point that post-editing is the new direction. Loulwah’s notes have still not been received.</w:t>
             </w:r>
           </w:p>
         </w:tc>
@@ -3526,7 +4091,7 @@
                 <w:sz w:val="18"/>
                 <w:szCs w:val="18"/>
               </w:rPr>
-              <w:t xml:space="preserve">A separate chapter with a term list and a section on terminology guides. Line 62 assigns this chapter to Masooma, so her work should be merged in.</w:t>
+              <w:t xml:space="preserve">A full chapter, now based on Masooma’s terminology chapter: definition, history, terminologists, types of terms, rules for good terms, the Arabic academies, termbases, terminology guides and standardisation bodies.</w:t>
             </w:r>
           </w:p>
         </w:tc>
@@ -9050,6 +9615,819 @@
     </w:p>
     <w:p>
       <w:pPr>
+        <w:pStyle w:val="Heading3"/>
+      </w:pPr>
+      <w:r>
+        <w:t xml:space="preserve">Corrections to the second batch of materials</w:t>
+      </w:r>
+    </w:p>
+    <w:tbl>
+      <w:tblPr>
+        <w:tblW w:type="dxa" w:w="9638"/>
+        <w:tblBorders>
+          <w:top w:val="single" w:color="CFC9DE" w:sz="4"/>
+          <w:left w:val="single" w:color="CFC9DE" w:sz="4"/>
+          <w:bottom w:val="single" w:color="CFC9DE" w:sz="4"/>
+          <w:right w:val="single" w:color="CFC9DE" w:sz="4"/>
+          <w:insideH w:val="single" w:color="CFC9DE" w:sz="4"/>
+          <w:insideV w:val="single" w:color="CFC9DE" w:sz="4"/>
+        </w:tblBorders>
+      </w:tblPr>
+      <w:tblGrid>
+        <w:gridCol w:w="3084"/>
+        <w:gridCol w:w="3277"/>
+        <w:gridCol w:w="3277"/>
+      </w:tblGrid>
+      <w:tr>
+        <w:trPr>
+          <w:tblHeader/>
+        </w:trPr>
+        <w:tc>
+          <w:tcPr>
+            <w:tcW w:type="dxa" w:w="3084"/>
+            <w:shd w:fill="EFEBF8" w:color="auto" w:val="clear"/>
+            <w:tcMar>
+              <w:top w:type="dxa" w:w="60"/>
+              <w:left w:type="dxa" w:w="90"/>
+              <w:bottom w:type="dxa" w:w="60"/>
+              <w:right w:type="dxa" w:w="90"/>
+            </w:tcMar>
+          </w:tcPr>
+          <w:p>
+            <w:pPr>
+              <w:spacing w:after="0" w:line="264"/>
+            </w:pPr>
+            <w:r>
+              <w:rPr>
+                <w:rFonts w:ascii="Calibri" w:cs="Calibri" w:eastAsia="Calibri" w:hAnsi="Calibri"/>
+                <w:b/>
+                <w:bCs/>
+                <w:color w:val="3D1591"/>
+                <w:sz w:val="18"/>
+                <w:szCs w:val="18"/>
+              </w:rPr>
+              <w:t xml:space="preserve">Source says</w:t>
+            </w:r>
+          </w:p>
+        </w:tc>
+        <w:tc>
+          <w:tcPr>
+            <w:tcW w:type="dxa" w:w="3277"/>
+            <w:shd w:fill="EFEBF8" w:color="auto" w:val="clear"/>
+            <w:tcMar>
+              <w:top w:type="dxa" w:w="60"/>
+              <w:left w:type="dxa" w:w="90"/>
+              <w:bottom w:type="dxa" w:w="60"/>
+              <w:right w:type="dxa" w:w="90"/>
+            </w:tcMar>
+          </w:tcPr>
+          <w:p>
+            <w:pPr>
+              <w:spacing w:after="0" w:line="264"/>
+            </w:pPr>
+            <w:r>
+              <w:rPr>
+                <w:rFonts w:ascii="Calibri" w:cs="Calibri" w:eastAsia="Calibri" w:hAnsi="Calibri"/>
+                <w:b/>
+                <w:bCs/>
+                <w:color w:val="3D1591"/>
+                <w:sz w:val="18"/>
+                <w:szCs w:val="18"/>
+              </w:rPr>
+              <w:t xml:space="preserve">Handbook says or does</w:t>
+            </w:r>
+          </w:p>
+        </w:tc>
+        <w:tc>
+          <w:tcPr>
+            <w:tcW w:type="dxa" w:w="3277"/>
+            <w:shd w:fill="EFEBF8" w:color="auto" w:val="clear"/>
+            <w:tcMar>
+              <w:top w:type="dxa" w:w="60"/>
+              <w:left w:type="dxa" w:w="90"/>
+              <w:bottom w:type="dxa" w:w="60"/>
+              <w:right w:type="dxa" w:w="90"/>
+            </w:tcMar>
+          </w:tcPr>
+          <w:p>
+            <w:pPr>
+              <w:spacing w:after="0" w:line="264"/>
+            </w:pPr>
+            <w:r>
+              <w:rPr>
+                <w:rFonts w:ascii="Calibri" w:cs="Calibri" w:eastAsia="Calibri" w:hAnsi="Calibri"/>
+                <w:b/>
+                <w:bCs/>
+                <w:color w:val="3D1591"/>
+                <w:sz w:val="18"/>
+                <w:szCs w:val="18"/>
+              </w:rPr>
+              <w:t xml:space="preserve">Reason</w:t>
+            </w:r>
+          </w:p>
+        </w:tc>
+      </w:tr>
+      <w:tr>
+        <w:trPr>
+          <w:cantSplit/>
+        </w:trPr>
+        <w:tc>
+          <w:tcPr>
+            <w:tcW w:type="dxa" w:w="3084"/>
+            <w:tcMar>
+              <w:top w:type="dxa" w:w="60"/>
+              <w:left w:type="dxa" w:w="90"/>
+              <w:bottom w:type="dxa" w:w="60"/>
+              <w:right w:type="dxa" w:w="90"/>
+            </w:tcMar>
+          </w:tcPr>
+          <w:p>
+            <w:pPr>
+              <w:spacing w:after="0" w:line="264"/>
+            </w:pPr>
+            <w:r>
+              <w:rPr>
+                <w:rFonts w:ascii="Calibri" w:cs="Calibri" w:eastAsia="Calibri" w:hAnsi="Calibri"/>
+                <w:sz w:val="18"/>
+                <w:szCs w:val="18"/>
+              </w:rPr>
+              <w:t xml:space="preserve">“Evan Zohar” (AVT notes)</w:t>
+            </w:r>
+          </w:p>
+        </w:tc>
+        <w:tc>
+          <w:tcPr>
+            <w:tcW w:type="dxa" w:w="3277"/>
+            <w:tcMar>
+              <w:top w:type="dxa" w:w="60"/>
+              <w:left w:type="dxa" w:w="90"/>
+              <w:bottom w:type="dxa" w:w="60"/>
+              <w:right w:type="dxa" w:w="90"/>
+            </w:tcMar>
+          </w:tcPr>
+          <w:p>
+            <w:pPr>
+              <w:spacing w:after="0" w:line="264"/>
+            </w:pPr>
+            <w:r>
+              <w:rPr>
+                <w:rFonts w:ascii="Calibri" w:cs="Calibri" w:eastAsia="Calibri" w:hAnsi="Calibri"/>
+                <w:sz w:val="18"/>
+                <w:szCs w:val="18"/>
+              </w:rPr>
+              <w:t xml:space="preserve">Itamar Even-Zohar</w:t>
+            </w:r>
+          </w:p>
+        </w:tc>
+        <w:tc>
+          <w:tcPr>
+            <w:tcW w:type="dxa" w:w="3277"/>
+            <w:tcMar>
+              <w:top w:type="dxa" w:w="60"/>
+              <w:left w:type="dxa" w:w="90"/>
+              <w:bottom w:type="dxa" w:w="60"/>
+              <w:right w:type="dxa" w:w="90"/>
+            </w:tcMar>
+          </w:tcPr>
+          <w:p>
+            <w:pPr>
+              <w:spacing w:after="0" w:line="264"/>
+            </w:pPr>
+            <w:r>
+              <w:rPr>
+                <w:rFonts w:ascii="Calibri" w:cs="Calibri" w:eastAsia="Calibri" w:hAnsi="Calibri"/>
+                <w:sz w:val="18"/>
+                <w:szCs w:val="18"/>
+              </w:rPr>
+              <w:t xml:space="preserve">Spelling of the author’s name.</w:t>
+            </w:r>
+          </w:p>
+        </w:tc>
+      </w:tr>
+      <w:tr>
+        <w:trPr>
+          <w:cantSplit/>
+        </w:trPr>
+        <w:tc>
+          <w:tcPr>
+            <w:tcW w:type="dxa" w:w="3084"/>
+            <w:tcMar>
+              <w:top w:type="dxa" w:w="60"/>
+              <w:left w:type="dxa" w:w="90"/>
+              <w:bottom w:type="dxa" w:w="60"/>
+              <w:right w:type="dxa" w:w="90"/>
+            </w:tcMar>
+          </w:tcPr>
+          <w:p>
+            <w:pPr>
+              <w:spacing w:after="0" w:line="264"/>
+            </w:pPr>
+            <w:r>
+              <w:rPr>
+                <w:rFonts w:ascii="Calibri" w:cs="Calibri" w:eastAsia="Calibri" w:hAnsi="Calibri"/>
+                <w:sz w:val="18"/>
+                <w:szCs w:val="18"/>
+              </w:rPr>
+              <w:t xml:space="preserve">“Hans J. Vermer”; “Diaz-Cintas/Rameal”; “explicatation”</w:t>
+            </w:r>
+          </w:p>
+        </w:tc>
+        <w:tc>
+          <w:tcPr>
+            <w:tcW w:type="dxa" w:w="3277"/>
+            <w:tcMar>
+              <w:top w:type="dxa" w:w="60"/>
+              <w:left w:type="dxa" w:w="90"/>
+              <w:bottom w:type="dxa" w:w="60"/>
+              <w:right w:type="dxa" w:w="90"/>
+            </w:tcMar>
+          </w:tcPr>
+          <w:p>
+            <w:pPr>
+              <w:spacing w:after="0" w:line="264"/>
+            </w:pPr>
+            <w:r>
+              <w:rPr>
+                <w:rFonts w:ascii="Calibri" w:cs="Calibri" w:eastAsia="Calibri" w:hAnsi="Calibri"/>
+                <w:sz w:val="18"/>
+                <w:szCs w:val="18"/>
+              </w:rPr>
+              <w:t xml:space="preserve">Vermeer; Díaz Cintas and Remael; explicitation</w:t>
+            </w:r>
+          </w:p>
+        </w:tc>
+        <w:tc>
+          <w:tcPr>
+            <w:tcW w:type="dxa" w:w="3277"/>
+            <w:tcMar>
+              <w:top w:type="dxa" w:w="60"/>
+              <w:left w:type="dxa" w:w="90"/>
+              <w:bottom w:type="dxa" w:w="60"/>
+              <w:right w:type="dxa" w:w="90"/>
+            </w:tcMar>
+          </w:tcPr>
+          <w:p>
+            <w:pPr>
+              <w:spacing w:after="0" w:line="264"/>
+            </w:pPr>
+            <w:r>
+              <w:rPr>
+                <w:rFonts w:ascii="Calibri" w:cs="Calibri" w:eastAsia="Calibri" w:hAnsi="Calibri"/>
+                <w:sz w:val="18"/>
+                <w:szCs w:val="18"/>
+              </w:rPr>
+              <w:t xml:space="preserve">Spelling.</w:t>
+            </w:r>
+          </w:p>
+        </w:tc>
+      </w:tr>
+      <w:tr>
+        <w:trPr>
+          <w:cantSplit/>
+        </w:trPr>
+        <w:tc>
+          <w:tcPr>
+            <w:tcW w:type="dxa" w:w="3084"/>
+            <w:tcMar>
+              <w:top w:type="dxa" w:w="60"/>
+              <w:left w:type="dxa" w:w="90"/>
+              <w:bottom w:type="dxa" w:w="60"/>
+              <w:right w:type="dxa" w:w="90"/>
+            </w:tcMar>
+          </w:tcPr>
+          <w:p>
+            <w:pPr>
+              <w:spacing w:after="0" w:line="264"/>
+            </w:pPr>
+            <w:r>
+              <w:rPr>
+                <w:rFonts w:ascii="Calibri" w:cs="Calibri" w:eastAsia="Calibri" w:hAnsi="Calibri"/>
+                <w:sz w:val="18"/>
+                <w:szCs w:val="18"/>
+              </w:rPr>
+              <w:t xml:space="preserve">Subtitles have “32 to 41 characters per line”</w:t>
+            </w:r>
+          </w:p>
+        </w:tc>
+        <w:tc>
+          <w:tcPr>
+            <w:tcW w:type="dxa" w:w="3277"/>
+            <w:tcMar>
+              <w:top w:type="dxa" w:w="60"/>
+              <w:left w:type="dxa" w:w="90"/>
+              <w:bottom w:type="dxa" w:w="60"/>
+              <w:right w:type="dxa" w:w="90"/>
+            </w:tcMar>
+          </w:tcPr>
+          <w:p>
+            <w:pPr>
+              <w:spacing w:after="0" w:line="264"/>
+            </w:pPr>
+            <w:r>
+              <w:rPr>
+                <w:rFonts w:ascii="Calibri" w:cs="Calibri" w:eastAsia="Calibri" w:hAnsi="Calibri"/>
+                <w:sz w:val="18"/>
+                <w:szCs w:val="18"/>
+              </w:rPr>
+              <w:t xml:space="preserve">Traditionally about 37–39 characters, up to 42 on streaming platforms; at most two lines</w:t>
+            </w:r>
+          </w:p>
+        </w:tc>
+        <w:tc>
+          <w:tcPr>
+            <w:tcW w:type="dxa" w:w="3277"/>
+            <w:tcMar>
+              <w:top w:type="dxa" w:w="60"/>
+              <w:left w:type="dxa" w:w="90"/>
+              <w:bottom w:type="dxa" w:w="60"/>
+              <w:right w:type="dxa" w:w="90"/>
+            </w:tcMar>
+          </w:tcPr>
+          <w:p>
+            <w:pPr>
+              <w:spacing w:after="0" w:line="264"/>
+            </w:pPr>
+            <w:r>
+              <w:rPr>
+                <w:rFonts w:ascii="Calibri" w:cs="Calibri" w:eastAsia="Calibri" w:hAnsi="Calibri"/>
+                <w:sz w:val="18"/>
+                <w:szCs w:val="18"/>
+              </w:rPr>
+              <w:t xml:space="preserve">The figure in Díaz Cintas and Remael (2021), found in the online check.</w:t>
+            </w:r>
+          </w:p>
+        </w:tc>
+      </w:tr>
+      <w:tr>
+        <w:trPr>
+          <w:cantSplit/>
+        </w:trPr>
+        <w:tc>
+          <w:tcPr>
+            <w:tcW w:type="dxa" w:w="3084"/>
+            <w:tcMar>
+              <w:top w:type="dxa" w:w="60"/>
+              <w:left w:type="dxa" w:w="90"/>
+              <w:bottom w:type="dxa" w:w="60"/>
+              <w:right w:type="dxa" w:w="90"/>
+            </w:tcMar>
+          </w:tcPr>
+          <w:p>
+            <w:pPr>
+              <w:spacing w:after="0" w:line="264"/>
+            </w:pPr>
+            <w:r>
+              <w:rPr>
+                <w:rFonts w:ascii="Calibri" w:cs="Calibri" w:eastAsia="Calibri" w:hAnsi="Calibri"/>
+                <w:sz w:val="18"/>
+                <w:szCs w:val="18"/>
+              </w:rPr>
+              <w:t xml:space="preserve">“Wüster (Vienna School)” in the 1930s</w:t>
+            </w:r>
+          </w:p>
+        </w:tc>
+        <w:tc>
+          <w:tcPr>
+            <w:tcW w:type="dxa" w:w="3277"/>
+            <w:tcMar>
+              <w:top w:type="dxa" w:w="60"/>
+              <w:left w:type="dxa" w:w="90"/>
+              <w:bottom w:type="dxa" w:w="60"/>
+              <w:right w:type="dxa" w:w="90"/>
+            </w:tcMar>
+          </w:tcPr>
+          <w:p>
+            <w:pPr>
+              <w:spacing w:after="0" w:line="264"/>
+            </w:pPr>
+            <w:r>
+              <w:rPr>
+                <w:rFonts w:ascii="Calibri" w:cs="Calibri" w:eastAsia="Calibri" w:hAnsi="Calibri"/>
+                <w:sz w:val="18"/>
+                <w:szCs w:val="18"/>
+              </w:rPr>
+              <w:t xml:space="preserve">Wüster’s 1931 doctoral thesis founded the field; he is linked with the Vienna School</w:t>
+            </w:r>
+          </w:p>
+        </w:tc>
+        <w:tc>
+          <w:tcPr>
+            <w:tcW w:type="dxa" w:w="3277"/>
+            <w:tcMar>
+              <w:top w:type="dxa" w:w="60"/>
+              <w:left w:type="dxa" w:w="90"/>
+              <w:bottom w:type="dxa" w:w="60"/>
+              <w:right w:type="dxa" w:w="90"/>
+            </w:tcMar>
+          </w:tcPr>
+          <w:p>
+            <w:pPr>
+              <w:spacing w:after="0" w:line="264"/>
+            </w:pPr>
+            <w:r>
+              <w:rPr>
+                <w:rFonts w:ascii="Calibri" w:cs="Calibri" w:eastAsia="Calibri" w:hAnsi="Calibri"/>
+                <w:sz w:val="18"/>
+                <w:szCs w:val="18"/>
+              </w:rPr>
+              <w:t xml:space="preserve">Wüster’s founding work was a 1931 thesis published in Berlin; the Vienna work came later.</w:t>
+            </w:r>
+          </w:p>
+        </w:tc>
+      </w:tr>
+      <w:tr>
+        <w:trPr>
+          <w:cantSplit/>
+        </w:trPr>
+        <w:tc>
+          <w:tcPr>
+            <w:tcW w:type="dxa" w:w="3084"/>
+            <w:tcMar>
+              <w:top w:type="dxa" w:w="60"/>
+              <w:left w:type="dxa" w:w="90"/>
+              <w:bottom w:type="dxa" w:w="60"/>
+              <w:right w:type="dxa" w:w="90"/>
+            </w:tcMar>
+          </w:tcPr>
+          <w:p>
+            <w:pPr>
+              <w:spacing w:after="0" w:line="264"/>
+            </w:pPr>
+            <w:r>
+              <w:rPr>
+                <w:rFonts w:ascii="Calibri" w:cs="Calibri" w:eastAsia="Calibri" w:hAnsi="Calibri"/>
+                <w:sz w:val="18"/>
+                <w:szCs w:val="18"/>
+              </w:rPr>
+              <w:t xml:space="preserve">ISO “handles all technical specifications except electrical and electronic engineering”</w:t>
+            </w:r>
+          </w:p>
+        </w:tc>
+        <w:tc>
+          <w:tcPr>
+            <w:tcW w:type="dxa" w:w="3277"/>
+            <w:tcMar>
+              <w:top w:type="dxa" w:w="60"/>
+              <w:left w:type="dxa" w:w="90"/>
+              <w:bottom w:type="dxa" w:w="60"/>
+              <w:right w:type="dxa" w:w="90"/>
+            </w:tcMar>
+          </w:tcPr>
+          <w:p>
+            <w:pPr>
+              <w:spacing w:after="0" w:line="264"/>
+            </w:pPr>
+            <w:r>
+              <w:rPr>
+                <w:rFonts w:ascii="Calibri" w:cs="Calibri" w:eastAsia="Calibri" w:hAnsi="Calibri"/>
+                <w:sz w:val="18"/>
+                <w:szCs w:val="18"/>
+              </w:rPr>
+              <w:t xml:space="preserve">ISO, with IEC for electrical and electronic standards and ITU for telecommunications</w:t>
+            </w:r>
+          </w:p>
+        </w:tc>
+        <w:tc>
+          <w:tcPr>
+            <w:tcW w:type="dxa" w:w="3277"/>
+            <w:tcMar>
+              <w:top w:type="dxa" w:w="60"/>
+              <w:left w:type="dxa" w:w="90"/>
+              <w:bottom w:type="dxa" w:w="60"/>
+              <w:right w:type="dxa" w:w="90"/>
+            </w:tcMar>
+          </w:tcPr>
+          <w:p>
+            <w:pPr>
+              <w:spacing w:after="0" w:line="264"/>
+            </w:pPr>
+            <w:r>
+              <w:rPr>
+                <w:rFonts w:ascii="Calibri" w:cs="Calibri" w:eastAsia="Calibri" w:hAnsi="Calibri"/>
+                <w:sz w:val="18"/>
+                <w:szCs w:val="18"/>
+              </w:rPr>
+              <w:t xml:space="preserve">Telecommunications standards belong to the ITU.</w:t>
+            </w:r>
+          </w:p>
+        </w:tc>
+      </w:tr>
+      <w:tr>
+        <w:trPr>
+          <w:cantSplit/>
+        </w:trPr>
+        <w:tc>
+          <w:tcPr>
+            <w:tcW w:type="dxa" w:w="3084"/>
+            <w:tcMar>
+              <w:top w:type="dxa" w:w="60"/>
+              <w:left w:type="dxa" w:w="90"/>
+              <w:bottom w:type="dxa" w:w="60"/>
+              <w:right w:type="dxa" w:w="90"/>
+            </w:tcMar>
+          </w:tcPr>
+          <w:p>
+            <w:pPr>
+              <w:spacing w:after="0" w:line="264"/>
+            </w:pPr>
+            <w:r>
+              <w:rPr>
+                <w:rFonts w:ascii="Calibri" w:cs="Calibri" w:eastAsia="Calibri" w:hAnsi="Calibri"/>
+                <w:sz w:val="18"/>
+                <w:szCs w:val="18"/>
+              </w:rPr>
+              <w:t xml:space="preserve">“over 150 countries” (ISO)</w:t>
+            </w:r>
+          </w:p>
+        </w:tc>
+        <w:tc>
+          <w:tcPr>
+            <w:tcW w:type="dxa" w:w="3277"/>
+            <w:tcMar>
+              <w:top w:type="dxa" w:w="60"/>
+              <w:left w:type="dxa" w:w="90"/>
+              <w:bottom w:type="dxa" w:w="60"/>
+              <w:right w:type="dxa" w:w="90"/>
+            </w:tcMar>
+          </w:tcPr>
+          <w:p>
+            <w:pPr>
+              <w:spacing w:after="0" w:line="264"/>
+            </w:pPr>
+            <w:r>
+              <w:rPr>
+                <w:rFonts w:ascii="Calibri" w:cs="Calibri" w:eastAsia="Calibri" w:hAnsi="Calibri"/>
+                <w:sz w:val="18"/>
+                <w:szCs w:val="18"/>
+              </w:rPr>
+              <w:t xml:space="preserve">Not stated</w:t>
+            </w:r>
+          </w:p>
+        </w:tc>
+        <w:tc>
+          <w:tcPr>
+            <w:tcW w:type="dxa" w:w="3277"/>
+            <w:tcMar>
+              <w:top w:type="dxa" w:w="60"/>
+              <w:left w:type="dxa" w:w="90"/>
+              <w:bottom w:type="dxa" w:w="60"/>
+              <w:right w:type="dxa" w:w="90"/>
+            </w:tcMar>
+          </w:tcPr>
+          <w:p>
+            <w:pPr>
+              <w:spacing w:after="0" w:line="264"/>
+            </w:pPr>
+            <w:r>
+              <w:rPr>
+                <w:rFonts w:ascii="Calibri" w:cs="Calibri" w:eastAsia="Calibri" w:hAnsi="Calibri"/>
+                <w:sz w:val="18"/>
+                <w:szCs w:val="18"/>
+              </w:rPr>
+              <w:t xml:space="preserve">The number changes over time; it was left out rather than risk an outdated figure.</w:t>
+            </w:r>
+          </w:p>
+        </w:tc>
+      </w:tr>
+      <w:tr>
+        <w:trPr>
+          <w:cantSplit/>
+        </w:trPr>
+        <w:tc>
+          <w:tcPr>
+            <w:tcW w:type="dxa" w:w="3084"/>
+            <w:tcMar>
+              <w:top w:type="dxa" w:w="60"/>
+              <w:left w:type="dxa" w:w="90"/>
+              <w:bottom w:type="dxa" w:w="60"/>
+              <w:right w:type="dxa" w:w="90"/>
+            </w:tcMar>
+          </w:tcPr>
+          <w:p>
+            <w:pPr>
+              <w:spacing w:after="0" w:line="264"/>
+            </w:pPr>
+            <w:r>
+              <w:rPr>
+                <w:rFonts w:ascii="Calibri" w:cs="Calibri" w:eastAsia="Calibri" w:hAnsi="Calibri"/>
+                <w:sz w:val="18"/>
+                <w:szCs w:val="18"/>
+              </w:rPr>
+              <w:t xml:space="preserve">“foreign language/culture (informal) and target language/culture (formal)” (AVT notes)</w:t>
+            </w:r>
+          </w:p>
+        </w:tc>
+        <w:tc>
+          <w:tcPr>
+            <w:tcW w:type="dxa" w:w="3277"/>
+            <w:tcMar>
+              <w:top w:type="dxa" w:w="60"/>
+              <w:left w:type="dxa" w:w="90"/>
+              <w:bottom w:type="dxa" w:w="60"/>
+              <w:right w:type="dxa" w:w="90"/>
+            </w:tcMar>
+          </w:tcPr>
+          <w:p>
+            <w:pPr>
+              <w:spacing w:after="0" w:line="264"/>
+            </w:pPr>
+            <w:r>
+              <w:rPr>
+                <w:rFonts w:ascii="Calibri" w:cs="Calibri" w:eastAsia="Calibri" w:hAnsi="Calibri"/>
+                <w:sz w:val="18"/>
+                <w:szCs w:val="18"/>
+              </w:rPr>
+              <w:t xml:space="preserve">Left out</w:t>
+            </w:r>
+          </w:p>
+        </w:tc>
+        <w:tc>
+          <w:tcPr>
+            <w:tcW w:type="dxa" w:w="3277"/>
+            <w:tcMar>
+              <w:top w:type="dxa" w:w="60"/>
+              <w:left w:type="dxa" w:w="90"/>
+              <w:bottom w:type="dxa" w:w="60"/>
+              <w:right w:type="dxa" w:w="90"/>
+            </w:tcMar>
+          </w:tcPr>
+          <w:p>
+            <w:pPr>
+              <w:spacing w:after="0" w:line="264"/>
+            </w:pPr>
+            <w:r>
+              <w:rPr>
+                <w:rFonts w:ascii="Calibri" w:cs="Calibri" w:eastAsia="Calibri" w:hAnsi="Calibri"/>
+                <w:sz w:val="18"/>
+                <w:szCs w:val="18"/>
+              </w:rPr>
+              <w:t xml:space="preserve">Unclear, and not true in general.</w:t>
+            </w:r>
+          </w:p>
+        </w:tc>
+      </w:tr>
+      <w:tr>
+        <w:trPr>
+          <w:cantSplit/>
+        </w:trPr>
+        <w:tc>
+          <w:tcPr>
+            <w:tcW w:type="dxa" w:w="3084"/>
+            <w:tcMar>
+              <w:top w:type="dxa" w:w="60"/>
+              <w:left w:type="dxa" w:w="90"/>
+              <w:bottom w:type="dxa" w:w="60"/>
+              <w:right w:type="dxa" w:w="90"/>
+            </w:tcMar>
+          </w:tcPr>
+          <w:p>
+            <w:pPr>
+              <w:spacing w:after="0" w:line="264"/>
+            </w:pPr>
+            <w:r>
+              <w:rPr>
+                <w:rFonts w:ascii="Calibri" w:cs="Calibri" w:eastAsia="Calibri" w:hAnsi="Calibri"/>
+                <w:sz w:val="18"/>
+                <w:szCs w:val="18"/>
+              </w:rPr>
+              <w:t xml:space="preserve">Dubbing “mainly used in Europe, America and Asia”</w:t>
+            </w:r>
+          </w:p>
+        </w:tc>
+        <w:tc>
+          <w:tcPr>
+            <w:tcW w:type="dxa" w:w="3277"/>
+            <w:tcMar>
+              <w:top w:type="dxa" w:w="60"/>
+              <w:left w:type="dxa" w:w="90"/>
+              <w:bottom w:type="dxa" w:w="60"/>
+              <w:right w:type="dxa" w:w="90"/>
+            </w:tcMar>
+          </w:tcPr>
+          <w:p>
+            <w:pPr>
+              <w:spacing w:after="0" w:line="264"/>
+            </w:pPr>
+            <w:r>
+              <w:rPr>
+                <w:rFonts w:ascii="Calibri" w:cs="Calibri" w:eastAsia="Calibri" w:hAnsi="Calibri"/>
+                <w:sz w:val="18"/>
+                <w:szCs w:val="18"/>
+              </w:rPr>
+              <w:t xml:space="preserve">Common for cartoons, games and commercials, and widely used in the Arab world for children’s programmes and series</w:t>
+            </w:r>
+          </w:p>
+        </w:tc>
+        <w:tc>
+          <w:tcPr>
+            <w:tcW w:type="dxa" w:w="3277"/>
+            <w:tcMar>
+              <w:top w:type="dxa" w:w="60"/>
+              <w:left w:type="dxa" w:w="90"/>
+              <w:bottom w:type="dxa" w:w="60"/>
+              <w:right w:type="dxa" w:w="90"/>
+            </w:tcMar>
+          </w:tcPr>
+          <w:p>
+            <w:pPr>
+              <w:spacing w:after="0" w:line="264"/>
+            </w:pPr>
+            <w:r>
+              <w:rPr>
+                <w:rFonts w:ascii="Calibri" w:cs="Calibri" w:eastAsia="Calibri" w:hAnsi="Calibri"/>
+                <w:sz w:val="18"/>
+                <w:szCs w:val="18"/>
+              </w:rPr>
+              <w:t xml:space="preserve">More accurate and more relevant for Arab readers.</w:t>
+            </w:r>
+          </w:p>
+        </w:tc>
+      </w:tr>
+      <w:tr>
+        <w:trPr>
+          <w:cantSplit/>
+        </w:trPr>
+        <w:tc>
+          <w:tcPr>
+            <w:tcW w:type="dxa" w:w="3084"/>
+            <w:tcMar>
+              <w:top w:type="dxa" w:w="60"/>
+              <w:left w:type="dxa" w:w="90"/>
+              <w:bottom w:type="dxa" w:w="60"/>
+              <w:right w:type="dxa" w:w="90"/>
+            </w:tcMar>
+          </w:tcPr>
+          <w:p>
+            <w:pPr>
+              <w:spacing w:after="0" w:line="264"/>
+            </w:pPr>
+            <w:r>
+              <w:rPr>
+                <w:rFonts w:ascii="Calibri" w:cs="Calibri" w:eastAsia="Calibri" w:hAnsi="Calibri"/>
+                <w:sz w:val="18"/>
+                <w:szCs w:val="18"/>
+              </w:rPr>
+              <w:t xml:space="preserve">YouTube example links (AVT notes)</w:t>
+            </w:r>
+          </w:p>
+        </w:tc>
+        <w:tc>
+          <w:tcPr>
+            <w:tcW w:type="dxa" w:w="3277"/>
+            <w:tcMar>
+              <w:top w:type="dxa" w:w="60"/>
+              <w:left w:type="dxa" w:w="90"/>
+              <w:bottom w:type="dxa" w:w="60"/>
+              <w:right w:type="dxa" w:w="90"/>
+            </w:tcMar>
+          </w:tcPr>
+          <w:p>
+            <w:pPr>
+              <w:spacing w:after="0" w:line="264"/>
+            </w:pPr>
+            <w:r>
+              <w:rPr>
+                <w:rFonts w:ascii="Calibri" w:cs="Calibri" w:eastAsia="Calibri" w:hAnsi="Calibri"/>
+                <w:sz w:val="18"/>
+                <w:szCs w:val="18"/>
+              </w:rPr>
+              <w:t xml:space="preserve">Left out</w:t>
+            </w:r>
+          </w:p>
+        </w:tc>
+        <w:tc>
+          <w:tcPr>
+            <w:tcW w:type="dxa" w:w="3277"/>
+            <w:tcMar>
+              <w:top w:type="dxa" w:w="60"/>
+              <w:left w:type="dxa" w:w="90"/>
+              <w:bottom w:type="dxa" w:w="60"/>
+              <w:right w:type="dxa" w:w="90"/>
+            </w:tcMar>
+          </w:tcPr>
+          <w:p>
+            <w:pPr>
+              <w:spacing w:after="0" w:line="264"/>
+            </w:pPr>
+            <w:r>
+              <w:rPr>
+                <w:rFonts w:ascii="Calibri" w:cs="Calibri" w:eastAsia="Calibri" w:hAnsi="Calibri"/>
+                <w:sz w:val="18"/>
+                <w:szCs w:val="18"/>
+              </w:rPr>
+              <w:t xml:space="preserve">Links can stop working in a printed book; the team can add current examples in workshops.</w:t>
+            </w:r>
+          </w:p>
+        </w:tc>
+      </w:tr>
+    </w:tbl>
+    <w:p>
+      <w:pPr>
+        <w:spacing w:after="120"/>
+      </w:pPr>
+    </w:p>
+    <w:p>
+      <w:pPr>
         <w:pStyle w:val="Heading1"/>
       </w:pPr>
       <w:r>
@@ -9851,6 +11229,83 @@
                 <w:szCs w:val="18"/>
               </w:rPr>
               <w:t xml:space="preserve">Requested in the notes. The two news texts were written for the handbook.</w:t>
+            </w:r>
+          </w:p>
+        </w:tc>
+      </w:tr>
+      <w:tr>
+        <w:trPr>
+          <w:cantSplit/>
+        </w:trPr>
+        <w:tc>
+          <w:tcPr>
+            <w:tcW w:type="dxa" w:w="2891"/>
+            <w:tcMar>
+              <w:top w:type="dxa" w:w="60"/>
+              <w:left w:type="dxa" w:w="90"/>
+              <w:bottom w:type="dxa" w:w="60"/>
+              <w:right w:type="dxa" w:w="90"/>
+            </w:tcMar>
+          </w:tcPr>
+          <w:p>
+            <w:pPr>
+              <w:spacing w:after="0" w:line="264"/>
+            </w:pPr>
+            <w:r>
+              <w:rPr>
+                <w:rFonts w:ascii="Calibri" w:cs="Calibri" w:eastAsia="Calibri" w:hAnsi="Calibri"/>
+                <w:sz w:val="18"/>
+                <w:szCs w:val="18"/>
+              </w:rPr>
+              <w:t xml:space="preserve">Explanations added to the AVT notes</w:t>
+            </w:r>
+          </w:p>
+        </w:tc>
+        <w:tc>
+          <w:tcPr>
+            <w:tcW w:type="dxa" w:w="1735"/>
+            <w:tcMar>
+              <w:top w:type="dxa" w:w="60"/>
+              <w:left w:type="dxa" w:w="90"/>
+              <w:bottom w:type="dxa" w:w="60"/>
+              <w:right w:type="dxa" w:w="90"/>
+            </w:tcMar>
+          </w:tcPr>
+          <w:p>
+            <w:pPr>
+              <w:spacing w:after="0" w:line="264"/>
+            </w:pPr>
+            <w:r>
+              <w:rPr>
+                <w:rFonts w:ascii="Calibri" w:cs="Calibri" w:eastAsia="Calibri" w:hAnsi="Calibri"/>
+                <w:sz w:val="18"/>
+                <w:szCs w:val="18"/>
+              </w:rPr>
+              <w:t xml:space="preserve">Part 9</w:t>
+            </w:r>
+          </w:p>
+        </w:tc>
+        <w:tc>
+          <w:tcPr>
+            <w:tcW w:type="dxa" w:w="5012"/>
+            <w:tcMar>
+              <w:top w:type="dxa" w:w="60"/>
+              <w:left w:type="dxa" w:w="90"/>
+              <w:bottom w:type="dxa" w:w="60"/>
+              <w:right w:type="dxa" w:w="90"/>
+            </w:tcMar>
+          </w:tcPr>
+          <w:p>
+            <w:pPr>
+              <w:spacing w:after="0" w:line="264"/>
+            </w:pPr>
+            <w:r>
+              <w:rPr>
+                <w:rFonts w:ascii="Calibri" w:cs="Calibri" w:eastAsia="Calibri" w:hAnsi="Calibri"/>
+                <w:sz w:val="18"/>
+                <w:szCs w:val="18"/>
+              </w:rPr>
+              <w:t xml:space="preserve">The notes were in short point form. Explanations were added for anchoring, redundancy, semiotic cohesion, subtitling “vulnerability” and the four channels of meaning; dubbing in the Arab world; and the link between Skopos theory and Nida’s dynamic equivalence (Nida, 1964).</w:t>
             </w:r>
           </w:p>
         </w:tc>
@@ -11417,7 +12872,7 @@
         <w:rPr>
           <w:rFonts w:ascii="Calibri" w:cs="Calibri" w:eastAsia="Calibri" w:hAnsi="Calibri"/>
         </w:rPr>
-        <w:t xml:space="preserve"> Merge the work assigned to Shaikha, Masooma (practice texts and terminology) and Loulwah (dictionary examples and machine translation).</w:t>
+        <w:t xml:space="preserve"> Merge the remaining work assigned to Shaikha (examples), Masooma (practice texts) and Loulwah (dictionary examples and machine translation). Masooma’s terminology chapter is already included.</w:t>
       </w:r>
     </w:p>
     <w:p>
@@ -13226,6 +14681,591 @@
                 <w:szCs w:val="18"/>
               </w:rPr>
               <w:t xml:space="preserve">Citation and reference corrected.</w:t>
+            </w:r>
+          </w:p>
+        </w:tc>
+      </w:tr>
+      <w:tr>
+        <w:trPr>
+          <w:cantSplit/>
+        </w:trPr>
+        <w:tc>
+          <w:tcPr>
+            <w:tcW w:type="dxa" w:w="3277"/>
+            <w:tcMar>
+              <w:top w:type="dxa" w:w="60"/>
+              <w:left w:type="dxa" w:w="90"/>
+              <w:bottom w:type="dxa" w:w="60"/>
+              <w:right w:type="dxa" w:w="90"/>
+            </w:tcMar>
+          </w:tcPr>
+          <w:p>
+            <w:pPr>
+              <w:spacing w:after="0" w:line="264"/>
+            </w:pPr>
+            <w:r>
+              <w:rPr>
+                <w:rFonts w:ascii="Calibri" w:cs="Calibri" w:eastAsia="Calibri" w:hAnsi="Calibri"/>
+                <w:sz w:val="18"/>
+                <w:szCs w:val="18"/>
+              </w:rPr>
+              <w:t xml:space="preserve">Pérez-González (2014); Díaz Cintas and Remael (2007, 2021); Pedersen (2011); Reiss and Vermeer (1984); Nida (1964); Toury (1995); Even-Zohar (1990); ISO 704:2022</w:t>
+            </w:r>
+          </w:p>
+        </w:tc>
+        <w:tc>
+          <w:tcPr>
+            <w:tcW w:type="dxa" w:w="2891"/>
+            <w:tcMar>
+              <w:top w:type="dxa" w:w="60"/>
+              <w:left w:type="dxa" w:w="90"/>
+              <w:bottom w:type="dxa" w:w="60"/>
+              <w:right w:type="dxa" w:w="90"/>
+            </w:tcMar>
+          </w:tcPr>
+          <w:p>
+            <w:pPr>
+              <w:spacing w:after="0" w:line="264"/>
+            </w:pPr>
+            <w:r>
+              <w:rPr>
+                <w:rFonts w:ascii="Calibri" w:cs="Calibri" w:eastAsia="Calibri" w:hAnsi="Calibri"/>
+                <w:b/>
+                <w:bCs/>
+                <w:sz w:val="18"/>
+                <w:szCs w:val="18"/>
+              </w:rPr>
+              <w:t xml:space="preserve">Confirmed</w:t>
+            </w:r>
+          </w:p>
+        </w:tc>
+        <w:tc>
+          <w:tcPr>
+            <w:tcW w:type="dxa" w:w="3470"/>
+            <w:tcMar>
+              <w:top w:type="dxa" w:w="60"/>
+              <w:left w:type="dxa" w:w="90"/>
+              <w:bottom w:type="dxa" w:w="60"/>
+              <w:right w:type="dxa" w:w="90"/>
+            </w:tcMar>
+          </w:tcPr>
+          <w:p>
+            <w:pPr>
+              <w:spacing w:after="0" w:line="264"/>
+            </w:pPr>
+            <w:r>
+              <w:rPr>
+                <w:rFonts w:ascii="Calibri" w:cs="Calibri" w:eastAsia="Calibri" w:hAnsi="Calibri"/>
+                <w:sz w:val="18"/>
+                <w:szCs w:val="18"/>
+              </w:rPr>
+              <w:t xml:space="preserve">Details completed (full title of Nida, 1964).</w:t>
+            </w:r>
+          </w:p>
+        </w:tc>
+      </w:tr>
+      <w:tr>
+        <w:trPr>
+          <w:cantSplit/>
+        </w:trPr>
+        <w:tc>
+          <w:tcPr>
+            <w:tcW w:type="dxa" w:w="3277"/>
+            <w:tcMar>
+              <w:top w:type="dxa" w:w="60"/>
+              <w:left w:type="dxa" w:w="90"/>
+              <w:bottom w:type="dxa" w:w="60"/>
+              <w:right w:type="dxa" w:w="90"/>
+            </w:tcMar>
+          </w:tcPr>
+          <w:p>
+            <w:pPr>
+              <w:spacing w:after="0" w:line="264"/>
+            </w:pPr>
+            <w:r>
+              <w:rPr>
+                <w:rFonts w:ascii="Calibri" w:cs="Calibri" w:eastAsia="Calibri" w:hAnsi="Calibri"/>
+                <w:sz w:val="18"/>
+                <w:szCs w:val="18"/>
+              </w:rPr>
+              <w:t xml:space="preserve">Gambier (2003): three relationships at the heart of AVT</w:t>
+            </w:r>
+          </w:p>
+        </w:tc>
+        <w:tc>
+          <w:tcPr>
+            <w:tcW w:type="dxa" w:w="2891"/>
+            <w:tcMar>
+              <w:top w:type="dxa" w:w="60"/>
+              <w:left w:type="dxa" w:w="90"/>
+              <w:bottom w:type="dxa" w:w="60"/>
+              <w:right w:type="dxa" w:w="90"/>
+            </w:tcMar>
+          </w:tcPr>
+          <w:p>
+            <w:pPr>
+              <w:spacing w:after="0" w:line="264"/>
+            </w:pPr>
+            <w:r>
+              <w:rPr>
+                <w:rFonts w:ascii="Calibri" w:cs="Calibri" w:eastAsia="Calibri" w:hAnsi="Calibri"/>
+                <w:b/>
+                <w:bCs/>
+                <w:sz w:val="18"/>
+                <w:szCs w:val="18"/>
+              </w:rPr>
+              <w:t xml:space="preserve">Confirmed</w:t>
+            </w:r>
+            <w:r>
+              <w:rPr>
+                <w:rFonts w:ascii="Calibri" w:cs="Calibri" w:eastAsia="Calibri" w:hAnsi="Calibri"/>
+                <w:sz w:val="18"/>
+                <w:szCs w:val="18"/>
+              </w:rPr>
+              <w:t xml:space="preserve"> through secondary sources; page not checked</w:t>
+            </w:r>
+          </w:p>
+        </w:tc>
+        <w:tc>
+          <w:tcPr>
+            <w:tcW w:type="dxa" w:w="3470"/>
+            <w:tcMar>
+              <w:top w:type="dxa" w:w="60"/>
+              <w:left w:type="dxa" w:w="90"/>
+              <w:bottom w:type="dxa" w:w="60"/>
+              <w:right w:type="dxa" w:w="90"/>
+            </w:tcMar>
+          </w:tcPr>
+          <w:p>
+            <w:pPr>
+              <w:spacing w:after="0" w:line="264"/>
+            </w:pPr>
+            <w:r>
+              <w:rPr>
+                <w:rFonts w:ascii="Calibri" w:cs="Calibri" w:eastAsia="Calibri" w:hAnsi="Calibri"/>
+                <w:sz w:val="18"/>
+                <w:szCs w:val="18"/>
+              </w:rPr>
+              <w:t xml:space="preserve">Cited without a page number.</w:t>
+            </w:r>
+          </w:p>
+        </w:tc>
+      </w:tr>
+      <w:tr>
+        <w:trPr>
+          <w:cantSplit/>
+        </w:trPr>
+        <w:tc>
+          <w:tcPr>
+            <w:tcW w:type="dxa" w:w="3277"/>
+            <w:tcMar>
+              <w:top w:type="dxa" w:w="60"/>
+              <w:left w:type="dxa" w:w="90"/>
+              <w:bottom w:type="dxa" w:w="60"/>
+              <w:right w:type="dxa" w:w="90"/>
+            </w:tcMar>
+          </w:tcPr>
+          <w:p>
+            <w:pPr>
+              <w:spacing w:after="0" w:line="264"/>
+            </w:pPr>
+            <w:r>
+              <w:rPr>
+                <w:rFonts w:ascii="Calibri" w:cs="Calibri" w:eastAsia="Calibri" w:hAnsi="Calibri"/>
+                <w:sz w:val="18"/>
+                <w:szCs w:val="18"/>
+              </w:rPr>
+              <w:t xml:space="preserve">O’Hagan (2007): “screen translation” thought too narrow by some</w:t>
+            </w:r>
+          </w:p>
+        </w:tc>
+        <w:tc>
+          <w:tcPr>
+            <w:tcW w:type="dxa" w:w="2891"/>
+            <w:tcMar>
+              <w:top w:type="dxa" w:w="60"/>
+              <w:left w:type="dxa" w:w="90"/>
+              <w:bottom w:type="dxa" w:w="60"/>
+              <w:right w:type="dxa" w:w="90"/>
+            </w:tcMar>
+          </w:tcPr>
+          <w:p>
+            <w:pPr>
+              <w:spacing w:after="0" w:line="264"/>
+            </w:pPr>
+            <w:r>
+              <w:rPr>
+                <w:rFonts w:ascii="Calibri" w:cs="Calibri" w:eastAsia="Calibri" w:hAnsi="Calibri"/>
+                <w:b/>
+                <w:bCs/>
+                <w:sz w:val="18"/>
+                <w:szCs w:val="18"/>
+              </w:rPr>
+              <w:t xml:space="preserve">Not confirmed</w:t>
+            </w:r>
+            <w:r>
+              <w:rPr>
+                <w:rFonts w:ascii="Calibri" w:cs="Calibri" w:eastAsia="Calibri" w:hAnsi="Calibri"/>
+                <w:sz w:val="18"/>
+                <w:szCs w:val="18"/>
+              </w:rPr>
+              <w:t xml:space="preserve">: the reference exists, but the claim is taken from the course notes</w:t>
+            </w:r>
+          </w:p>
+        </w:tc>
+        <w:tc>
+          <w:tcPr>
+            <w:tcW w:type="dxa" w:w="3470"/>
+            <w:tcMar>
+              <w:top w:type="dxa" w:w="60"/>
+              <w:left w:type="dxa" w:w="90"/>
+              <w:bottom w:type="dxa" w:w="60"/>
+              <w:right w:type="dxa" w:w="90"/>
+            </w:tcMar>
+          </w:tcPr>
+          <w:p>
+            <w:pPr>
+              <w:spacing w:after="0" w:line="264"/>
+            </w:pPr>
+            <w:r>
+              <w:rPr>
+                <w:rFonts w:ascii="Calibri" w:cs="Calibri" w:eastAsia="Calibri" w:hAnsi="Calibri"/>
+                <w:sz w:val="18"/>
+                <w:szCs w:val="18"/>
+              </w:rPr>
+              <w:t xml:space="preserve">Kept as cited in the course notes; please check the article.</w:t>
+            </w:r>
+          </w:p>
+        </w:tc>
+      </w:tr>
+      <w:tr>
+        <w:trPr>
+          <w:cantSplit/>
+        </w:trPr>
+        <w:tc>
+          <w:tcPr>
+            <w:tcW w:type="dxa" w:w="3277"/>
+            <w:tcMar>
+              <w:top w:type="dxa" w:w="60"/>
+              <w:left w:type="dxa" w:w="90"/>
+              <w:bottom w:type="dxa" w:w="60"/>
+              <w:right w:type="dxa" w:w="90"/>
+            </w:tcMar>
+          </w:tcPr>
+          <w:p>
+            <w:pPr>
+              <w:spacing w:after="0" w:line="264"/>
+            </w:pPr>
+            <w:r>
+              <w:rPr>
+                <w:rFonts w:ascii="Calibri" w:cs="Calibri" w:eastAsia="Calibri" w:hAnsi="Calibri"/>
+                <w:sz w:val="18"/>
+                <w:szCs w:val="18"/>
+              </w:rPr>
+              <w:t xml:space="preserve">Díaz Cintas and Remael: subtitle line length</w:t>
+            </w:r>
+          </w:p>
+        </w:tc>
+        <w:tc>
+          <w:tcPr>
+            <w:tcW w:type="dxa" w:w="2891"/>
+            <w:tcMar>
+              <w:top w:type="dxa" w:w="60"/>
+              <w:left w:type="dxa" w:w="90"/>
+              <w:bottom w:type="dxa" w:w="60"/>
+              <w:right w:type="dxa" w:w="90"/>
+            </w:tcMar>
+          </w:tcPr>
+          <w:p>
+            <w:pPr>
+              <w:spacing w:after="0" w:line="264"/>
+            </w:pPr>
+            <w:r>
+              <w:rPr>
+                <w:rFonts w:ascii="Calibri" w:cs="Calibri" w:eastAsia="Calibri" w:hAnsi="Calibri"/>
+                <w:b/>
+                <w:bCs/>
+                <w:sz w:val="18"/>
+                <w:szCs w:val="18"/>
+              </w:rPr>
+              <w:t xml:space="preserve">Corrected</w:t>
+            </w:r>
+          </w:p>
+        </w:tc>
+        <w:tc>
+          <w:tcPr>
+            <w:tcW w:type="dxa" w:w="3470"/>
+            <w:tcMar>
+              <w:top w:type="dxa" w:w="60"/>
+              <w:left w:type="dxa" w:w="90"/>
+              <w:bottom w:type="dxa" w:w="60"/>
+              <w:right w:type="dxa" w:w="90"/>
+            </w:tcMar>
+          </w:tcPr>
+          <w:p>
+            <w:pPr>
+              <w:spacing w:after="0" w:line="264"/>
+            </w:pPr>
+            <w:r>
+              <w:rPr>
+                <w:rFonts w:ascii="Calibri" w:cs="Calibri" w:eastAsia="Calibri" w:hAnsi="Calibri"/>
+                <w:sz w:val="18"/>
+                <w:szCs w:val="18"/>
+              </w:rPr>
+              <w:t xml:space="preserve">Changed to about 37–39 characters, up to 42 on streaming platforms.</w:t>
+            </w:r>
+          </w:p>
+        </w:tc>
+      </w:tr>
+      <w:tr>
+        <w:trPr>
+          <w:cantSplit/>
+        </w:trPr>
+        <w:tc>
+          <w:tcPr>
+            <w:tcW w:type="dxa" w:w="3277"/>
+            <w:tcMar>
+              <w:top w:type="dxa" w:w="60"/>
+              <w:left w:type="dxa" w:w="90"/>
+              <w:bottom w:type="dxa" w:w="60"/>
+              <w:right w:type="dxa" w:w="90"/>
+            </w:tcMar>
+          </w:tcPr>
+          <w:p>
+            <w:pPr>
+              <w:spacing w:after="0" w:line="264"/>
+            </w:pPr>
+            <w:r>
+              <w:rPr>
+                <w:rFonts w:ascii="Calibri" w:cs="Calibri" w:eastAsia="Calibri" w:hAnsi="Calibri"/>
+                <w:sz w:val="18"/>
+                <w:szCs w:val="18"/>
+              </w:rPr>
+              <w:t xml:space="preserve">Wüster and the history of terminology (Cabré, 1999)</w:t>
+            </w:r>
+          </w:p>
+        </w:tc>
+        <w:tc>
+          <w:tcPr>
+            <w:tcW w:type="dxa" w:w="2891"/>
+            <w:tcMar>
+              <w:top w:type="dxa" w:w="60"/>
+              <w:left w:type="dxa" w:w="90"/>
+              <w:bottom w:type="dxa" w:w="60"/>
+              <w:right w:type="dxa" w:w="90"/>
+            </w:tcMar>
+          </w:tcPr>
+          <w:p>
+            <w:pPr>
+              <w:spacing w:after="0" w:line="264"/>
+            </w:pPr>
+            <w:r>
+              <w:rPr>
+                <w:rFonts w:ascii="Calibri" w:cs="Calibri" w:eastAsia="Calibri" w:hAnsi="Calibri"/>
+                <w:b/>
+                <w:bCs/>
+                <w:sz w:val="18"/>
+                <w:szCs w:val="18"/>
+              </w:rPr>
+              <w:t xml:space="preserve">Corrected</w:t>
+            </w:r>
+            <w:r>
+              <w:rPr>
+                <w:rFonts w:ascii="Calibri" w:cs="Calibri" w:eastAsia="Calibri" w:hAnsi="Calibri"/>
+                <w:sz w:val="18"/>
+                <w:szCs w:val="18"/>
+              </w:rPr>
+              <w:t xml:space="preserve"> in detail</w:t>
+            </w:r>
+          </w:p>
+        </w:tc>
+        <w:tc>
+          <w:tcPr>
+            <w:tcW w:type="dxa" w:w="3470"/>
+            <w:tcMar>
+              <w:top w:type="dxa" w:w="60"/>
+              <w:left w:type="dxa" w:w="90"/>
+              <w:bottom w:type="dxa" w:w="60"/>
+              <w:right w:type="dxa" w:w="90"/>
+            </w:tcMar>
+          </w:tcPr>
+          <w:p>
+            <w:pPr>
+              <w:spacing w:after="0" w:line="264"/>
+            </w:pPr>
+            <w:r>
+              <w:rPr>
+                <w:rFonts w:ascii="Calibri" w:cs="Calibri" w:eastAsia="Calibri" w:hAnsi="Calibri"/>
+                <w:sz w:val="18"/>
+                <w:szCs w:val="18"/>
+              </w:rPr>
+              <w:t xml:space="preserve">Wüster’s 1931 thesis; Cabré’s four periods confirmed.</w:t>
+            </w:r>
+          </w:p>
+        </w:tc>
+      </w:tr>
+      <w:tr>
+        <w:trPr>
+          <w:cantSplit/>
+        </w:trPr>
+        <w:tc>
+          <w:tcPr>
+            <w:tcW w:type="dxa" w:w="3277"/>
+            <w:tcMar>
+              <w:top w:type="dxa" w:w="60"/>
+              <w:left w:type="dxa" w:w="90"/>
+              <w:bottom w:type="dxa" w:w="60"/>
+              <w:right w:type="dxa" w:w="90"/>
+            </w:tcMar>
+          </w:tcPr>
+          <w:p>
+            <w:pPr>
+              <w:spacing w:after="0" w:line="264"/>
+            </w:pPr>
+            <w:r>
+              <w:rPr>
+                <w:rFonts w:ascii="Calibri" w:cs="Calibri" w:eastAsia="Calibri" w:hAnsi="Calibri"/>
+                <w:sz w:val="18"/>
+                <w:szCs w:val="18"/>
+              </w:rPr>
+              <w:t xml:space="preserve">ISO facts (1947, Geneva, English, French and Russian)</w:t>
+            </w:r>
+          </w:p>
+        </w:tc>
+        <w:tc>
+          <w:tcPr>
+            <w:tcW w:type="dxa" w:w="2891"/>
+            <w:tcMar>
+              <w:top w:type="dxa" w:w="60"/>
+              <w:left w:type="dxa" w:w="90"/>
+              <w:bottom w:type="dxa" w:w="60"/>
+              <w:right w:type="dxa" w:w="90"/>
+            </w:tcMar>
+          </w:tcPr>
+          <w:p>
+            <w:pPr>
+              <w:spacing w:after="0" w:line="264"/>
+            </w:pPr>
+            <w:r>
+              <w:rPr>
+                <w:rFonts w:ascii="Calibri" w:cs="Calibri" w:eastAsia="Calibri" w:hAnsi="Calibri"/>
+                <w:b/>
+                <w:bCs/>
+                <w:sz w:val="18"/>
+                <w:szCs w:val="18"/>
+              </w:rPr>
+              <w:t xml:space="preserve">Confirmed</w:t>
+            </w:r>
+          </w:p>
+        </w:tc>
+        <w:tc>
+          <w:tcPr>
+            <w:tcW w:type="dxa" w:w="3470"/>
+            <w:tcMar>
+              <w:top w:type="dxa" w:w="60"/>
+              <w:left w:type="dxa" w:w="90"/>
+              <w:bottom w:type="dxa" w:w="60"/>
+              <w:right w:type="dxa" w:w="90"/>
+            </w:tcMar>
+          </w:tcPr>
+          <w:p>
+            <w:pPr>
+              <w:spacing w:after="0" w:line="264"/>
+            </w:pPr>
+            <w:r>
+              <w:rPr>
+                <w:rFonts w:ascii="Calibri" w:cs="Calibri" w:eastAsia="Calibri" w:hAnsi="Calibri"/>
+                <w:sz w:val="18"/>
+                <w:szCs w:val="18"/>
+              </w:rPr>
+              <w:t xml:space="preserve">None needed.</w:t>
+            </w:r>
+          </w:p>
+        </w:tc>
+      </w:tr>
+      <w:tr>
+        <w:trPr>
+          <w:cantSplit/>
+        </w:trPr>
+        <w:tc>
+          <w:tcPr>
+            <w:tcW w:type="dxa" w:w="3277"/>
+            <w:tcMar>
+              <w:top w:type="dxa" w:w="60"/>
+              <w:left w:type="dxa" w:w="90"/>
+              <w:bottom w:type="dxa" w:w="60"/>
+              <w:right w:type="dxa" w:w="90"/>
+            </w:tcMar>
+          </w:tcPr>
+          <w:p>
+            <w:pPr>
+              <w:spacing w:after="0" w:line="264"/>
+            </w:pPr>
+            <w:r>
+              <w:rPr>
+                <w:rFonts w:ascii="Calibri" w:cs="Calibri" w:eastAsia="Calibri" w:hAnsi="Calibri"/>
+                <w:sz w:val="18"/>
+                <w:szCs w:val="18"/>
+              </w:rPr>
+              <w:t xml:space="preserve">The Arabic academies’ methods (terminology chapter)</w:t>
+            </w:r>
+          </w:p>
+        </w:tc>
+        <w:tc>
+          <w:tcPr>
+            <w:tcW w:type="dxa" w:w="2891"/>
+            <w:tcMar>
+              <w:top w:type="dxa" w:w="60"/>
+              <w:left w:type="dxa" w:w="90"/>
+              <w:bottom w:type="dxa" w:w="60"/>
+              <w:right w:type="dxa" w:w="90"/>
+            </w:tcMar>
+          </w:tcPr>
+          <w:p>
+            <w:pPr>
+              <w:spacing w:after="0" w:line="264"/>
+            </w:pPr>
+            <w:r>
+              <w:rPr>
+                <w:rFonts w:ascii="Calibri" w:cs="Calibri" w:eastAsia="Calibri" w:hAnsi="Calibri"/>
+                <w:b/>
+                <w:bCs/>
+                <w:sz w:val="18"/>
+                <w:szCs w:val="18"/>
+              </w:rPr>
+              <w:t xml:space="preserve">Not checked</w:t>
+            </w:r>
+            <w:r>
+              <w:rPr>
+                <w:rFonts w:ascii="Calibri" w:cs="Calibri" w:eastAsia="Calibri" w:hAnsi="Calibri"/>
+                <w:sz w:val="18"/>
+                <w:szCs w:val="18"/>
+              </w:rPr>
+              <w:t xml:space="preserve"> (no online source found in the time available)</w:t>
+            </w:r>
+          </w:p>
+        </w:tc>
+        <w:tc>
+          <w:tcPr>
+            <w:tcW w:type="dxa" w:w="3470"/>
+            <w:tcMar>
+              <w:top w:type="dxa" w:w="60"/>
+              <w:left w:type="dxa" w:w="90"/>
+              <w:bottom w:type="dxa" w:w="60"/>
+              <w:right w:type="dxa" w:w="90"/>
+            </w:tcMar>
+          </w:tcPr>
+          <w:p>
+            <w:pPr>
+              <w:spacing w:after="0" w:line="264"/>
+            </w:pPr>
+            <w:r>
+              <w:rPr>
+                <w:rFonts w:ascii="Calibri" w:cs="Calibri" w:eastAsia="Calibri" w:hAnsi="Calibri"/>
+                <w:sz w:val="18"/>
+                <w:szCs w:val="18"/>
+              </w:rPr>
+              <w:t xml:space="preserve">Attributed to the team’s terminology chapter; please confirm the source Masooma used.</w:t>
             </w:r>
           </w:p>
         </w:tc>

</xml_diff>

<commit_message>
Simplify the handbook for clarity
- Chapter 21 and Part 9 rewritten in shorter, plainer sentences
- The two overlapping subtitling strategy lists merged into one
- Every sentence of 30 words or more split or shortened
- Level 3 practice instructions turned into a numbered list
- Feedback report updated

Co-Authored-By: Claude Opus 5.5 <noreply@anthropic.com>
Claude-Session: https://claude.ai/code/session_01VkNWz9zCVkDAANuF8jpQYy
</commit_message>
<xml_diff>
--- a/Handbook-Feedback-Report.docx
+++ b/Handbook-Feedback-Report.docx
@@ -163,7 +163,7 @@
         <w:rPr>
           <w:rFonts w:ascii="Calibri" w:cs="Calibri" w:eastAsia="Calibri" w:hAnsi="Calibri"/>
         </w:rPr>
-        <w:t xml:space="preserve">An editable Word document (Translation-Handbook.docx), B5 size, about 100 pages, in a simple layout based on the style of Guild’s posts.</w:t>
+        <w:t xml:space="preserve">An editable Word document (Translation-Handbook.docx), B5 size, about 97 pages, in a simple layout based on the style of Guild’s posts.</w:t>
       </w:r>
     </w:p>
     <w:p>
@@ -255,7 +255,7 @@
         <w:rPr>
           <w:rFonts w:ascii="Calibri" w:cs="Calibri" w:eastAsia="Calibri" w:hAnsi="Calibri"/>
         </w:rPr>
-        <w:t xml:space="preserve">Back matter: practice in three levels with an answer key, five checklists (including one based on Fairclough and a placeholder for Dr Abdullah’s framework), future editions, a glossary of 110 terms built from the key terms of every chapter, the references and a back cover.</w:t>
+        <w:t xml:space="preserve">Back matter: practice in three levels with an answer key, five checklists (including one based on Fairclough and a placeholder for Dr Abdullah’s framework), future editions, a glossary of 109 terms built from the key terms of every chapter, the references and a back cover.</w:t>
       </w:r>
     </w:p>
     <w:p>
@@ -2079,7 +2079,7 @@
                 <w:sz w:val="18"/>
                 <w:szCs w:val="18"/>
               </w:rPr>
-              <w:t xml:space="preserve">8. Word document, third version (current)</w:t>
+              <w:t xml:space="preserve">8. Word document, third version</w:t>
             </w:r>
           </w:p>
         </w:tc>
@@ -2128,6 +2128,83 @@
                 <w:szCs w:val="18"/>
               </w:rPr>
               <w:t xml:space="preserve">New materials and Guild posts supplied, with full authority to edit, add and remove.</w:t>
+            </w:r>
+          </w:p>
+        </w:tc>
+      </w:tr>
+      <w:tr>
+        <w:trPr>
+          <w:cantSplit/>
+        </w:trPr>
+        <w:tc>
+          <w:tcPr>
+            <w:tcW w:type="dxa" w:w="2506"/>
+            <w:tcMar>
+              <w:top w:type="dxa" w:w="60"/>
+              <w:left w:type="dxa" w:w="90"/>
+              <w:bottom w:type="dxa" w:w="60"/>
+              <w:right w:type="dxa" w:w="90"/>
+            </w:tcMar>
+          </w:tcPr>
+          <w:p>
+            <w:pPr>
+              <w:spacing w:after="0" w:line="264"/>
+            </w:pPr>
+            <w:r>
+              <w:rPr>
+                <w:rFonts w:ascii="Calibri" w:cs="Calibri" w:eastAsia="Calibri" w:hAnsi="Calibri"/>
+                <w:sz w:val="18"/>
+                <w:szCs w:val="18"/>
+              </w:rPr>
+              <w:t xml:space="preserve">9. Clarity pass (current)</w:t>
+            </w:r>
+          </w:p>
+        </w:tc>
+        <w:tc>
+          <w:tcPr>
+            <w:tcW w:type="dxa" w:w="3855"/>
+            <w:tcMar>
+              <w:top w:type="dxa" w:w="60"/>
+              <w:left w:type="dxa" w:w="90"/>
+              <w:bottom w:type="dxa" w:w="60"/>
+              <w:right w:type="dxa" w:w="90"/>
+            </w:tcMar>
+          </w:tcPr>
+          <w:p>
+            <w:pPr>
+              <w:spacing w:after="0" w:line="264"/>
+            </w:pPr>
+            <w:r>
+              <w:rPr>
+                <w:rFonts w:ascii="Calibri" w:cs="Calibri" w:eastAsia="Calibri" w:hAnsi="Calibri"/>
+                <w:sz w:val="18"/>
+                <w:szCs w:val="18"/>
+              </w:rPr>
+              <w:t xml:space="preserve">Chapter 21 and Part 9 rewritten in shorter, plainer sentences; the two overlapping subtitling strategy lists (Díaz Cintas and Remael; Pedersen) merged into one list of eight; every sentence of 30 words or more in the other chapters split or shortened; the Level 3 instructions turned into a numbered list.</w:t>
+            </w:r>
+          </w:p>
+        </w:tc>
+        <w:tc>
+          <w:tcPr>
+            <w:tcW w:type="dxa" w:w="3277"/>
+            <w:tcMar>
+              <w:top w:type="dxa" w:w="60"/>
+              <w:left w:type="dxa" w:w="90"/>
+              <w:bottom w:type="dxa" w:w="60"/>
+              <w:right w:type="dxa" w:w="90"/>
+            </w:tcMar>
+          </w:tcPr>
+          <w:p>
+            <w:pPr>
+              <w:spacing w:after="0" w:line="264"/>
+            </w:pPr>
+            <w:r>
+              <w:rPr>
+                <w:rFonts w:ascii="Calibri" w:cs="Calibri" w:eastAsia="Calibri" w:hAnsi="Calibri"/>
+                <w:sz w:val="18"/>
+                <w:szCs w:val="18"/>
+              </w:rPr>
+              <w:t xml:space="preserve">Instruction: “simplicity is the key; make it as clear as possible.”</w:t>
             </w:r>
           </w:p>
         </w:tc>

</xml_diff>

<commit_message>
Keep the handbook at beginner level
- Theory for specialists removed: communication model, history sections,
  Schleiermacher, Fairclough's theory (now three simple questions in
  Chapter 19, Words and points of view), terminology history, standards
  bodies and academy procedures, AVT field history and three AVT theories
- Key terms reduced to what beginners need (glossary now 102 terms)
- Ten references that are no longer cited removed; all 38 citations match
  the reference list
- Feedback report updated

Co-Authored-By: Claude Opus 5.5 <noreply@anthropic.com>
Claude-Session: https://claude.ai/code/session_01VkNWz9zCVkDAANuF8jpQYy
</commit_message>
<xml_diff>
--- a/Handbook-Feedback-Report.docx
+++ b/Handbook-Feedback-Report.docx
@@ -163,7 +163,7 @@
         <w:rPr>
           <w:rFonts w:ascii="Calibri" w:cs="Calibri" w:eastAsia="Calibri" w:hAnsi="Calibri"/>
         </w:rPr>
-        <w:t xml:space="preserve">An editable Word document (Translation-Handbook.docx), B5 size, about 97 pages, in a simple layout based on the style of Guild’s posts.</w:t>
+        <w:t xml:space="preserve">An editable Word document (Translation-Handbook.docx), B5 size, about 93 pages, in a simple layout based on the style of Guild’s posts.</w:t>
       </w:r>
     </w:p>
     <w:p>
@@ -255,7 +255,7 @@
         <w:rPr>
           <w:rFonts w:ascii="Calibri" w:cs="Calibri" w:eastAsia="Calibri" w:hAnsi="Calibri"/>
         </w:rPr>
-        <w:t xml:space="preserve">Back matter: practice in three levels with an answer key, five checklists (including one based on Fairclough and a placeholder for Dr Abdullah’s framework), future editions, a glossary of 109 terms built from the key terms of every chapter, the references and a back cover.</w:t>
+        <w:t xml:space="preserve">Back matter: practice in three levels with an answer key, five checklists (including one based on Fairclough and a placeholder for Dr Abdullah’s framework), future editions, a glossary of 102 terms built from the key terms of every chapter, the references and a back cover.</w:t>
       </w:r>
     </w:p>
     <w:p>
@@ -2156,7 +2156,7 @@
                 <w:sz w:val="18"/>
                 <w:szCs w:val="18"/>
               </w:rPr>
-              <w:t xml:space="preserve">9. Clarity pass (current)</w:t>
+              <w:t xml:space="preserve">9. Clarity pass</w:t>
             </w:r>
           </w:p>
         </w:tc>
@@ -2205,6 +2205,83 @@
                 <w:szCs w:val="18"/>
               </w:rPr>
               <w:t xml:space="preserve">Instruction: “simplicity is the key; make it as clear as possible.”</w:t>
+            </w:r>
+          </w:p>
+        </w:tc>
+      </w:tr>
+      <w:tr>
+        <w:trPr>
+          <w:cantSplit/>
+        </w:trPr>
+        <w:tc>
+          <w:tcPr>
+            <w:tcW w:type="dxa" w:w="2506"/>
+            <w:tcMar>
+              <w:top w:type="dxa" w:w="60"/>
+              <w:left w:type="dxa" w:w="90"/>
+              <w:bottom w:type="dxa" w:w="60"/>
+              <w:right w:type="dxa" w:w="90"/>
+            </w:tcMar>
+          </w:tcPr>
+          <w:p>
+            <w:pPr>
+              <w:spacing w:after="0" w:line="264"/>
+            </w:pPr>
+            <w:r>
+              <w:rPr>
+                <w:rFonts w:ascii="Calibri" w:cs="Calibri" w:eastAsia="Calibri" w:hAnsi="Calibri"/>
+                <w:sz w:val="18"/>
+                <w:szCs w:val="18"/>
+              </w:rPr>
+              <w:t xml:space="preserve">10. Beginner pass (current)</w:t>
+            </w:r>
+          </w:p>
+        </w:tc>
+        <w:tc>
+          <w:tcPr>
+            <w:tcW w:type="dxa" w:w="3855"/>
+            <w:tcMar>
+              <w:top w:type="dxa" w:w="60"/>
+              <w:left w:type="dxa" w:w="90"/>
+              <w:bottom w:type="dxa" w:w="60"/>
+              <w:right w:type="dxa" w:w="90"/>
+            </w:tcMar>
+          </w:tcPr>
+          <w:p>
+            <w:pPr>
+              <w:spacing w:after="0" w:line="264"/>
+            </w:pPr>
+            <w:r>
+              <w:rPr>
+                <w:rFonts w:ascii="Calibri" w:cs="Calibri" w:eastAsia="Calibri" w:hAnsi="Calibri"/>
+                <w:sz w:val="18"/>
+                <w:szCs w:val="18"/>
+              </w:rPr>
+              <w:t xml:space="preserve">Theory for specialists removed: the communication model (Ch. 1), the history section (Ch. 10), Schleiermacher (Ch. 13), Fairclough’s theory reduced to three simple questions (Ch. 19, now “Words and points of view”), the history of terminology, the standards bodies and the academies’ procedures (Ch. 21), the history of the AVT field and three of its four theories (Ch. 26); key terms reduced to what beginners need; ten references no longer cited removed.</w:t>
+            </w:r>
+          </w:p>
+        </w:tc>
+        <w:tc>
+          <w:tcPr>
+            <w:tcW w:type="dxa" w:w="3277"/>
+            <w:tcMar>
+              <w:top w:type="dxa" w:w="60"/>
+              <w:left w:type="dxa" w:w="90"/>
+              <w:bottom w:type="dxa" w:w="60"/>
+              <w:right w:type="dxa" w:w="90"/>
+            </w:tcMar>
+          </w:tcPr>
+          <w:p>
+            <w:pPr>
+              <w:spacing w:after="0" w:line="264"/>
+            </w:pPr>
+            <w:r>
+              <w:rPr>
+                <w:rFonts w:ascii="Calibri" w:cs="Calibri" w:eastAsia="Calibri" w:hAnsi="Calibri"/>
+                <w:sz w:val="18"/>
+                <w:szCs w:val="18"/>
+              </w:rPr>
+              <w:t xml:space="preserve">Instruction: “you don’t have to go deep into theories; it is for beginners and should guide them.”</w:t>
             </w:r>
           </w:p>
         </w:tc>
@@ -4858,7 +4935,7 @@
                 <w:sz w:val="18"/>
                 <w:szCs w:val="18"/>
               </w:rPr>
-              <w:t xml:space="preserve">Done</w:t>
+              <w:t xml:space="preserve">Done, simplified</w:t>
             </w:r>
           </w:p>
         </w:tc>
@@ -4882,7 +4959,7 @@
                 <w:sz w:val="18"/>
                 <w:szCs w:val="18"/>
               </w:rPr>
-              <w:t xml:space="preserve">Chapter 19</w:t>
+              <w:t xml:space="preserve">Chapter 19; Checklist 3</w:t>
             </w:r>
           </w:p>
         </w:tc>
@@ -4906,7 +4983,7 @@
                 <w:sz w:val="18"/>
                 <w:szCs w:val="18"/>
               </w:rPr>
-              <w:t xml:space="preserve">Explained as a relational approach with three levels of questions. An expert should confirm that it matches what the professor intends.</w:t>
+              <w:t xml:space="preserve">Kept at beginner level: three practical questions based on Fairclough (1992). The theory itself was left out, as you asked. An expert should confirm this is enough for the professor.</w:t>
             </w:r>
           </w:p>
         </w:tc>
@@ -13175,7 +13252,7 @@
         <w:rPr>
           <w:rFonts w:ascii="Calibri" w:cs="Calibri" w:eastAsia="Calibri" w:hAnsi="Calibri"/>
         </w:rPr>
-        <w:t xml:space="preserve">The quotations and references were checked online through web search (search results only; the full texts of the books could not be opened). “Confirmed” means that several independent sources agreed on the wording, page or publication details. This check does not replace checking the books themselves.</w:t>
+        <w:t xml:space="preserve">The quotations and references were checked online through web search (search results only; the full texts of the books could not be opened). “Confirmed” means that several independent sources agreed on the wording, page or publication details. This check does not replace checking the books themselves. Some items below were later removed from the handbook in the beginner pass (for example Toury, Even-Zohar, O’Hagan and ISO 704), so they no longer need checking.</w:t>
       </w:r>
     </w:p>
     <w:tbl>

</xml_diff>

<commit_message>
Remove placeholders for the publishable edition
Write the acknowledgements and copyright line, and drop the editor and
ISBN lines. Leave out the Dr Abdullah checklist, whose framework was
not among the materials, and renumber the commentary checklist as 4.
Remove the 'to be confirmed' notes from the references and practice
texts, and list the planned future editions plainly.

Co-Authored-By: Claude Opus 5.5 <noreply@anthropic.com>
Claude-Session: https://claude.ai/code/session_01VkNWz9zCVkDAANuF8jpQYy
</commit_message>
<xml_diff>
--- a/Handbook-Feedback-Report.docx
+++ b/Handbook-Feedback-Report.docx
@@ -255,7 +255,7 @@
         <w:rPr>
           <w:rFonts w:ascii="Calibri" w:cs="Calibri" w:eastAsia="Calibri" w:hAnsi="Calibri"/>
         </w:rPr>
-        <w:t xml:space="preserve">Back matter: practice in three levels with an answer key, five checklists (including one based on Fairclough and a placeholder for Dr Abdullah’s framework), future editions, a glossary of 102 terms built from the key terms of every chapter, the references and a back cover.</w:t>
+        <w:t xml:space="preserve">Back matter: practice in three levels with an answer key, four checklists (including one based on Fairclough), future editions, a glossary of 102 terms built from the key terms of every chapter, the references and a back cover.</w:t>
       </w:r>
     </w:p>
     <w:p>
@@ -5062,7 +5062,7 @@
                 <w:sz w:val="18"/>
                 <w:szCs w:val="18"/>
               </w:rPr>
-              <w:t xml:space="preserve">Checklists 3 and 4</w:t>
+              <w:t xml:space="preserve">Checklist 3</w:t>
             </w:r>
           </w:p>
         </w:tc>
@@ -5086,7 +5086,7 @@
                 <w:sz w:val="18"/>
                 <w:szCs w:val="18"/>
               </w:rPr>
-              <w:t xml:space="preserve">The Fairclough checklist is done. The Dr Abdullah checklist is a placeholder, because the framework was not supplied.</w:t>
+              <w:t xml:space="preserve">The Fairclough checklist is done. The Dr Abdullah checklist is left out of this edition because his framework was not among the materials received. It can be added in the next edition.</w:t>
             </w:r>
           </w:p>
         </w:tc>
@@ -11334,7 +11334,7 @@
                 <w:sz w:val="18"/>
                 <w:szCs w:val="18"/>
               </w:rPr>
-              <w:t xml:space="preserve">Practice, answer key, five checklists, glossary, references</w:t>
+              <w:t xml:space="preserve">Practice, answer key, four checklists, glossary, references</w:t>
             </w:r>
           </w:p>
         </w:tc>
@@ -13137,7 +13137,7 @@
         <w:rPr>
           <w:rFonts w:ascii="Calibri" w:cs="Calibri" w:eastAsia="Calibri" w:hAnsi="Calibri"/>
         </w:rPr>
-        <w:t xml:space="preserve">Add Dr Abdullah’s framework and complete Checklist 4.</w:t>
+        <w:t xml:space="preserve">Add a checklist based on Dr Abdullah’s framework once the team has it (the professor’s notes, line 47).</w:t>
       </w:r>
     </w:p>
     <w:p>

</xml_diff>